<commit_message>
Docs: talking points v2 — live chart captures embedded, internal team primers per module
</commit_message>
<xml_diff>
--- a/docs/WorkWorld_MerchOps_Demo_Talking_Points.docx
+++ b/docs/WorkWorld_MerchOps_Demo_Talking_Points.docx
@@ -43,7 +43,7 @@
           <w:sz w:val="22"/>
           <w:szCs w:val="22"/>
         </w:rPr>
-        <w:t xml:space="preserve">Purpose · Logic · Data sources for every screen element</w:t>
+        <w:t xml:space="preserve">Purpose · Logic · Data sources for every screen element — with live captures and internal team primers</w:t>
       </w:r>
     </w:p>
     <w:p>
@@ -98,12 +98,129 @@
           <w:sz w:val="21"/>
           <w:szCs w:val="21"/>
         </w:rPr>
-        <w:t xml:space="preserve">Each of the ten modules gets a section below. For every visual on the screen you get three lines: PURPOSE is the sentence to say out loud — why the visual exists and the business question it answers. LOGIC is how the number is actually computed, in plain language, so you can answer "where does that come from?" without hand-waving. DATA names the Databricks view feeding the visual and the underlying tables behind it.</w:t>
-      </w:r>
-    </w:p>
+        <w:t xml:space="preserve">Each of the ten modules gets a section below. Shaded boxes marked FOR THE SOLUTIONSET TEAM are internal background — read them to get fluent, don't recite them to the client. For every visual you then get three lines: PURPOSE is the sentence to say out loud — why the visual exists and the business question it answers. LOGIC is how the number is actually computed, in plain language, so you can answer "where does that come from?" without hand-waving. DATA names the Databricks view feeding the visual and the underlying tables behind it. Where a visual is a chart or map, a live capture from the deployed app is embedded so you can prepare away from a screen.</w:t>
+      </w:r>
+    </w:p>
+    <w:tbl>
+      <w:tblPr>
+        <w:tblW w:type="dxa" w:w="9720"/>
+        <w:tblBorders>
+          <w:top w:val="single" w:color="C9D6EC" w:sz="4"/>
+          <w:left w:val="single" w:color="2E5BFF" w:sz="24"/>
+          <w:bottom w:val="single" w:color="C9D6EC" w:sz="4"/>
+          <w:right w:val="single" w:color="C9D6EC" w:sz="4"/>
+          <w:insideH w:val="none"/>
+          <w:insideV w:val="none"/>
+        </w:tblBorders>
+      </w:tblPr>
+      <w:tblGrid>
+        <w:gridCol w:w="9720"/>
+      </w:tblGrid>
+      <w:tr>
+        <w:tc>
+          <w:tcPr>
+            <w:tcW w:type="dxa" w:w="9720"/>
+            <w:shd w:fill="EEF3FF" w:val="clear"/>
+            <w:tcMar>
+              <w:top w:type="dxa" w:w="140"/>
+              <w:left w:type="dxa" w:w="220"/>
+              <w:bottom w:type="dxa" w:w="60"/>
+              <w:right w:type="dxa" w:w="220"/>
+            </w:tcMar>
+          </w:tcPr>
+          <w:p>
+            <w:pPr>
+              <w:spacing w:after="100"/>
+            </w:pPr>
+            <w:r>
+              <w:rPr>
+                <w:b/>
+                <w:bCs/>
+                <w:caps/>
+                <w:color w:val="2E5BFF"/>
+                <w:sz w:val="18"/>
+                <w:szCs w:val="18"/>
+              </w:rPr>
+              <w:t xml:space="preserve">FOR THE SOLUTIONSET TEAM — internal background, not client-facing</w:t>
+            </w:r>
+          </w:p>
+          <w:p>
+            <w:pPr>
+              <w:spacing w:after="80"/>
+            </w:pPr>
+            <w:r>
+              <w:rPr>
+                <w:b/>
+                <w:bCs/>
+                <w:color w:val="1F2A44"/>
+                <w:sz w:val="19"/>
+                <w:szCs w:val="19"/>
+              </w:rPr>
+              <w:t xml:space="preserve">The client in one paragraph: </w:t>
+            </w:r>
+            <w:r>
+              <w:rPr>
+                <w:sz w:val="19"/>
+                <w:szCs w:val="19"/>
+              </w:rPr>
+              <w:t xml:space="preserve">Gart Companies runs WorkWorld, a 38-store workwear retailer (think Carhartt jackets, work boots, hi-vis gear) on the US west coast. Vendors ship direct to each store rather than through a central warehouse — so every purchase order fans out into per-store documents, which is why reconciliation is painful. About 80% of the assortment is replenishment (the same core items, bought again and again) and 20% is seasonal (rainwear, insulated gear). Demand moves with weather — rain and cold snaps sell product — which most planning tools ignore.</w:t>
+            </w:r>
+          </w:p>
+          <w:p>
+            <w:pPr>
+              <w:spacing w:after="80"/>
+            </w:pPr>
+            <w:r>
+              <w:rPr>
+                <w:b/>
+                <w:bCs/>
+                <w:color w:val="1F2A44"/>
+                <w:sz w:val="19"/>
+                <w:szCs w:val="19"/>
+              </w:rPr>
+              <w:t xml:space="preserve">The application category: </w:t>
+            </w:r>
+            <w:r>
+              <w:rPr>
+                <w:sz w:val="19"/>
+                <w:szCs w:val="19"/>
+              </w:rPr>
+              <w:t xml:space="preserve">This app is a merchandise planning &amp; operations platform — the software layer that sits between the client's ERP (where POs and invoices technically live) and their BI/reports (where they look at what already happened). The category's job is the decisions in the middle: how much to buy, when to order it, from whom, at what price, when to mark it down, and whether the stores actually executed. Enterprise names in this space are Blue Yonder, o9, RELEX — built and priced for chains with hundreds of stores. Our angle: the 20% of that capability a 38-store chain actually needs, on the client's own Databricks lakehouse, at a fraction of the cost, with AI drafting the judgment calls a small merch team doesn't have headcount for.</w:t>
+            </w:r>
+          </w:p>
+          <w:p>
+            <w:pPr>
+              <w:spacing w:after="80"/>
+            </w:pPr>
+            <w:r>
+              <w:rPr>
+                <w:b/>
+                <w:bCs/>
+                <w:color w:val="1F2A44"/>
+                <w:sz w:val="19"/>
+                <w:szCs w:val="19"/>
+              </w:rPr>
+              <w:t xml:space="preserve">Why the demo is shaped this way: </w:t>
+            </w:r>
+            <w:r>
+              <w:rPr>
+                <w:sz w:val="19"/>
+                <w:szCs w:val="19"/>
+              </w:rPr>
+              <w:t xml:space="preserve">Every module ends in an action a human approves — a PO proposal, a debit memo, a price staging, a store task. That's deliberate: the pitch is not 'another dashboard,' it's 'the work happens here.' The recurring analytical theme is that vendors' quoted lead times are optimistic, so the engine plans on observed lead times instead — several visuals exist purely to prove that point with the client's own (demo) data.</w:t>
+            </w:r>
+          </w:p>
+        </w:tc>
+      </w:tr>
+    </w:tbl>
     <w:p>
       <w:pPr>
         <w:spacing w:after="120"/>
+      </w:pPr>
+    </w:p>
+    <w:p>
+      <w:pPr>
+        <w:spacing w:after="80"/>
       </w:pPr>
       <w:r>
         <w:rPr>
@@ -196,6 +313,123 @@
         <w:t xml:space="preserve">The landing page. One row of value-driver KPIs across the whole network, then the two curves every merchant conversation starts with: sales and margin. The message: this is a single pane over planning, buying, reconciliation, and store execution — not another report.</w:t>
       </w:r>
     </w:p>
+    <w:tbl>
+      <w:tblPr>
+        <w:tblW w:type="dxa" w:w="9720"/>
+        <w:tblBorders>
+          <w:top w:val="single" w:color="C9D6EC" w:sz="4"/>
+          <w:left w:val="single" w:color="2E5BFF" w:sz="24"/>
+          <w:bottom w:val="single" w:color="C9D6EC" w:sz="4"/>
+          <w:right w:val="single" w:color="C9D6EC" w:sz="4"/>
+          <w:insideH w:val="none"/>
+          <w:insideV w:val="none"/>
+        </w:tblBorders>
+      </w:tblPr>
+      <w:tblGrid>
+        <w:gridCol w:w="9720"/>
+      </w:tblGrid>
+      <w:tr>
+        <w:tc>
+          <w:tcPr>
+            <w:tcW w:type="dxa" w:w="9720"/>
+            <w:shd w:fill="EEF3FF" w:val="clear"/>
+            <w:tcMar>
+              <w:top w:type="dxa" w:w="140"/>
+              <w:left w:type="dxa" w:w="220"/>
+              <w:bottom w:type="dxa" w:w="60"/>
+              <w:right w:type="dxa" w:w="220"/>
+            </w:tcMar>
+          </w:tcPr>
+          <w:p>
+            <w:pPr>
+              <w:spacing w:after="100"/>
+            </w:pPr>
+            <w:r>
+              <w:rPr>
+                <w:b/>
+                <w:bCs/>
+                <w:caps/>
+                <w:color w:val="2E5BFF"/>
+                <w:sz w:val="18"/>
+                <w:szCs w:val="18"/>
+              </w:rPr>
+              <w:t xml:space="preserve">FOR THE SOLUTIONSET TEAM — internal background, not client-facing</w:t>
+            </w:r>
+          </w:p>
+          <w:p>
+            <w:pPr>
+              <w:spacing w:after="80"/>
+            </w:pPr>
+            <w:r>
+              <w:rPr>
+                <w:b/>
+                <w:bCs/>
+                <w:color w:val="1F2A44"/>
+                <w:sz w:val="19"/>
+                <w:szCs w:val="19"/>
+              </w:rPr>
+              <w:t xml:space="preserve">Concepts to know: </w:t>
+            </w:r>
+            <w:r>
+              <w:rPr>
+                <w:sz w:val="19"/>
+                <w:szCs w:val="19"/>
+              </w:rPr>
+              <w:t xml:space="preserve">A 'position' is one SKU at one store — the atomic unit of retail inventory (38 stores × thousands of SKUs = the position count). In-stock rate is the % of positions with stock on hand. Inventory turns = how many times a year the inventory 'sells through' (annual cost of goods ÷ inventory value at cost) — workwear retail lives around 2.5–4. Gross margin % is (sales − cost) ÷ sales. 'Meat sizes' is apparel slang for the core sizes (M/L/XL) that carry most volume; 'fringe' sizes are the edges (XS, 3XL).</w:t>
+            </w:r>
+          </w:p>
+          <w:p>
+            <w:pPr>
+              <w:spacing w:after="80"/>
+            </w:pPr>
+            <w:r>
+              <w:rPr>
+                <w:b/>
+                <w:bCs/>
+                <w:color w:val="1F2A44"/>
+                <w:sz w:val="19"/>
+                <w:szCs w:val="19"/>
+              </w:rPr>
+              <w:t xml:space="preserve">Client need: </w:t>
+            </w:r>
+            <w:r>
+              <w:rPr>
+                <w:sz w:val="19"/>
+                <w:szCs w:val="19"/>
+              </w:rPr>
+              <w:t xml:space="preserve">Leadership currently assembles this picture from emailed spreadsheets days after the fact. The Command Center's job in the demo is credibility in the first five minutes: real KPIs, computed live from the lakehouse, with red/amber states that point at the other nine modules.</w:t>
+            </w:r>
+          </w:p>
+          <w:p>
+            <w:pPr>
+              <w:spacing w:after="80"/>
+            </w:pPr>
+            <w:r>
+              <w:rPr>
+                <w:b/>
+                <w:bCs/>
+                <w:color w:val="1F2A44"/>
+                <w:sz w:val="19"/>
+                <w:szCs w:val="19"/>
+              </w:rPr>
+              <w:t xml:space="preserve">What to internalize: </w:t>
+            </w:r>
+            <w:r>
+              <w:rPr>
+                <w:sz w:val="19"/>
+                <w:szCs w:val="19"/>
+              </w:rPr>
+              <w:t xml:space="preserve">Every KPI here is a door into a module — if the client reacts to a tile (say, meat-size breaks), navigate to that module next rather than following the script order.</w:t>
+            </w:r>
+          </w:p>
+        </w:tc>
+      </w:tr>
+    </w:tbl>
+    <w:p>
+      <w:pPr>
+        <w:spacing w:after="120"/>
+      </w:pPr>
+    </w:p>
     <w:p>
       <w:pPr>
         <w:pStyle w:val="Heading2"/>
@@ -291,6 +525,68 @@
     </w:p>
     <w:p>
       <w:pPr>
+        <w:spacing w:after="40" w:before="40"/>
+        <w:jc w:val="center"/>
+      </w:pPr>
+      <w:r>
+        <w:drawing>
+          <wp:inline distT="0" distB="0" distL="0" distR="0">
+            <wp:extent cx="5267325" cy="2667000"/>
+            <wp:effectExtent t="0" r="0" b="0" l="0"/>
+            <wp:docPr id="1" name="" descr="" title=""/>
+            <wp:cNvGraphicFramePr>
+              <a:graphicFrameLocks xmlns:a="http://schemas.openxmlformats.org/drawingml/2006/main" noChangeAspect="1"/>
+            </wp:cNvGraphicFramePr>
+            <a:graphic xmlns:a="http://schemas.openxmlformats.org/drawingml/2006/main">
+              <a:graphicData uri="http://schemas.openxmlformats.org/drawingml/2006/picture">
+                <pic:pic xmlns:pic="http://schemas.openxmlformats.org/drawingml/2006/picture">
+                  <pic:nvPicPr>
+                    <pic:cNvPr id="0" name="" descr=""/>
+                    <pic:cNvPicPr>
+                      <a:picLocks noChangeAspect="1" noChangeArrowheads="1"/>
+                    </pic:cNvPicPr>
+                  </pic:nvPicPr>
+                  <pic:blipFill>
+                    <a:blip r:embed="rId7" cstate="none"/>
+                    <a:srcRect/>
+                    <a:stretch>
+                      <a:fillRect/>
+                    </a:stretch>
+                  </pic:blipFill>
+                  <pic:spPr bwMode="auto">
+                    <a:xfrm>
+                      <a:off x="0" y="0"/>
+                      <a:ext cx="5267325" cy="2667000"/>
+                    </a:xfrm>
+                    <a:prstGeom prst="rect">
+                      <a:avLst/>
+                    </a:prstGeom>
+                  </pic:spPr>
+                </pic:pic>
+              </a:graphicData>
+            </a:graphic>
+          </wp:inline>
+        </w:drawing>
+      </w:r>
+    </w:p>
+    <w:p>
+      <w:pPr>
+        <w:spacing w:after="120"/>
+        <w:jc w:val="center"/>
+      </w:pPr>
+      <w:r>
+        <w:rPr>
+          <w:i/>
+          <w:iCs/>
+          <w:color w:val="5A6880"/>
+          <w:sz w:val="16"/>
+          <w:szCs w:val="16"/>
+        </w:rPr>
+        <w:t xml:space="preserve">Captured live from the deployed app (demo data, anchor 2026-07-14).</w:t>
+      </w:r>
+    </w:p>
+    <w:p>
+      <w:pPr>
         <w:spacing w:after="80"/>
         <w:ind w:left="200"/>
       </w:pPr>
@@ -368,6 +664,68 @@
           <w:color w:val="2E5BFF"/>
         </w:rPr>
         <w:t xml:space="preserve">Weekly margin dollars (bar chart)</w:t>
+      </w:r>
+    </w:p>
+    <w:p>
+      <w:pPr>
+        <w:spacing w:after="40" w:before="40"/>
+        <w:jc w:val="center"/>
+      </w:pPr>
+      <w:r>
+        <w:drawing>
+          <wp:inline distT="0" distB="0" distL="0" distR="0">
+            <wp:extent cx="5267325" cy="2667000"/>
+            <wp:effectExtent t="0" r="0" b="0" l="0"/>
+            <wp:docPr id="1" name="" descr="" title=""/>
+            <wp:cNvGraphicFramePr>
+              <a:graphicFrameLocks xmlns:a="http://schemas.openxmlformats.org/drawingml/2006/main" noChangeAspect="1"/>
+            </wp:cNvGraphicFramePr>
+            <a:graphic xmlns:a="http://schemas.openxmlformats.org/drawingml/2006/main">
+              <a:graphicData uri="http://schemas.openxmlformats.org/drawingml/2006/picture">
+                <pic:pic xmlns:pic="http://schemas.openxmlformats.org/drawingml/2006/picture">
+                  <pic:nvPicPr>
+                    <pic:cNvPr id="0" name="" descr=""/>
+                    <pic:cNvPicPr>
+                      <a:picLocks noChangeAspect="1" noChangeArrowheads="1"/>
+                    </pic:cNvPicPr>
+                  </pic:nvPicPr>
+                  <pic:blipFill>
+                    <a:blip r:embed="rId8" cstate="none"/>
+                    <a:srcRect/>
+                    <a:stretch>
+                      <a:fillRect/>
+                    </a:stretch>
+                  </pic:blipFill>
+                  <pic:spPr bwMode="auto">
+                    <a:xfrm>
+                      <a:off x="0" y="0"/>
+                      <a:ext cx="5267325" cy="2667000"/>
+                    </a:xfrm>
+                    <a:prstGeom prst="rect">
+                      <a:avLst/>
+                    </a:prstGeom>
+                  </pic:spPr>
+                </pic:pic>
+              </a:graphicData>
+            </a:graphic>
+          </wp:inline>
+        </w:drawing>
+      </w:r>
+    </w:p>
+    <w:p>
+      <w:pPr>
+        <w:spacing w:after="120"/>
+        <w:jc w:val="center"/>
+      </w:pPr>
+      <w:r>
+        <w:rPr>
+          <w:i/>
+          <w:iCs/>
+          <w:color w:val="5A6880"/>
+          <w:sz w:val="16"/>
+          <w:szCs w:val="16"/>
+        </w:rPr>
+        <w:t xml:space="preserve">Captured live from the deployed app (demo data, anchor 2026-07-14).</w:t>
       </w:r>
     </w:p>
     <w:p>
@@ -471,6 +829,123 @@
         <w:t xml:space="preserve">The forecast is only useful when it becomes purchase timing. This module slices forecasted demand any way the buyer thinks (category, brand, vendor, store, region), shifts it back by vendor lead times to show when orders must be placed, and ends by generating an actual PO proposal.</w:t>
       </w:r>
     </w:p>
+    <w:tbl>
+      <w:tblPr>
+        <w:tblW w:type="dxa" w:w="9720"/>
+        <w:tblBorders>
+          <w:top w:val="single" w:color="C9D6EC" w:sz="4"/>
+          <w:left w:val="single" w:color="2E5BFF" w:sz="24"/>
+          <w:bottom w:val="single" w:color="C9D6EC" w:sz="4"/>
+          <w:right w:val="single" w:color="C9D6EC" w:sz="4"/>
+          <w:insideH w:val="none"/>
+          <w:insideV w:val="none"/>
+        </w:tblBorders>
+      </w:tblPr>
+      <w:tblGrid>
+        <w:gridCol w:w="9720"/>
+      </w:tblGrid>
+      <w:tr>
+        <w:tc>
+          <w:tcPr>
+            <w:tcW w:type="dxa" w:w="9720"/>
+            <w:shd w:fill="EEF3FF" w:val="clear"/>
+            <w:tcMar>
+              <w:top w:type="dxa" w:w="140"/>
+              <w:left w:type="dxa" w:w="220"/>
+              <w:bottom w:type="dxa" w:w="60"/>
+              <w:right w:type="dxa" w:w="220"/>
+            </w:tcMar>
+          </w:tcPr>
+          <w:p>
+            <w:pPr>
+              <w:spacing w:after="100"/>
+            </w:pPr>
+            <w:r>
+              <w:rPr>
+                <w:b/>
+                <w:bCs/>
+                <w:caps/>
+                <w:color w:val="2E5BFF"/>
+                <w:sz w:val="18"/>
+                <w:szCs w:val="18"/>
+              </w:rPr>
+              <w:t xml:space="preserve">FOR THE SOLUTIONSET TEAM — internal background, not client-facing</w:t>
+            </w:r>
+          </w:p>
+          <w:p>
+            <w:pPr>
+              <w:spacing w:after="80"/>
+            </w:pPr>
+            <w:r>
+              <w:rPr>
+                <w:b/>
+                <w:bCs/>
+                <w:color w:val="1F2A44"/>
+                <w:sz w:val="19"/>
+                <w:szCs w:val="19"/>
+              </w:rPr>
+              <w:t xml:space="preserve">Concepts to know: </w:t>
+            </w:r>
+            <w:r>
+              <w:rPr>
+                <w:sz w:val="19"/>
+                <w:szCs w:val="19"/>
+              </w:rPr>
+              <w:t xml:space="preserve">A demand forecast predicts units per store × SKU × week. Lead time is the gap between placing an order and receiving it — so to have goods for week X you must order by week X minus lead time (the 'order-by' date). Safety stock is the buffer held against forecast error and late deliveries. An 'open-to-buy' mindset means buyers care about when dollars get committed, not just how much.</w:t>
+            </w:r>
+          </w:p>
+          <w:p>
+            <w:pPr>
+              <w:spacing w:after="80"/>
+            </w:pPr>
+            <w:r>
+              <w:rPr>
+                <w:b/>
+                <w:bCs/>
+                <w:color w:val="1F2A44"/>
+                <w:sz w:val="19"/>
+                <w:szCs w:val="19"/>
+              </w:rPr>
+              <w:t xml:space="preserve">Client need: </w:t>
+            </w:r>
+            <w:r>
+              <w:rPr>
+                <w:sz w:val="19"/>
+                <w:szCs w:val="19"/>
+              </w:rPr>
+              <w:t xml:space="preserve">WorkWorld's buyers plan in spreadsheets, store by store, mostly reacting to what stocked out last week. Nobody currently converts the forecast into order timing, and nobody quantifies weather demand — even though rainwear demand is the most weather-sensitive thing they sell. The PO generator at the bottom is the module's payoff: it replaces the most laborious spreadsheet in the building.</w:t>
+            </w:r>
+          </w:p>
+          <w:p>
+            <w:pPr>
+              <w:spacing w:after="80"/>
+            </w:pPr>
+            <w:r>
+              <w:rPr>
+                <w:b/>
+                <w:bCs/>
+                <w:color w:val="1F2A44"/>
+                <w:sz w:val="19"/>
+                <w:szCs w:val="19"/>
+              </w:rPr>
+              <w:t xml:space="preserve">What to internalize: </w:t>
+            </w:r>
+            <w:r>
+              <w:rPr>
+                <w:sz w:val="19"/>
+                <w:szCs w:val="19"/>
+              </w:rPr>
+              <w:t xml:space="preserve">The order-by-week flip is the intellectual center of the whole demo. Demand plotted when it SELLS looks comfortable; the same demand plotted when it must be ORDERED shows bars in the past — demand already missed. If the client understands that one chart, everything else follows.</w:t>
+            </w:r>
+          </w:p>
+        </w:tc>
+      </w:tr>
+    </w:tbl>
+    <w:p>
+      <w:pPr>
+        <w:spacing w:after="120"/>
+      </w:pPr>
+    </w:p>
     <w:p>
       <w:pPr>
         <w:pStyle w:val="Heading2"/>
@@ -485,6 +960,68 @@
     </w:p>
     <w:p>
       <w:pPr>
+        <w:spacing w:after="40" w:before="40"/>
+        <w:jc w:val="center"/>
+      </w:pPr>
+      <w:r>
+        <w:drawing>
+          <wp:inline distT="0" distB="0" distL="0" distR="0">
+            <wp:extent cx="6096000" cy="1790700"/>
+            <wp:effectExtent t="0" r="0" b="0" l="0"/>
+            <wp:docPr id="1" name="" descr="" title=""/>
+            <wp:cNvGraphicFramePr>
+              <a:graphicFrameLocks xmlns:a="http://schemas.openxmlformats.org/drawingml/2006/main" noChangeAspect="1"/>
+            </wp:cNvGraphicFramePr>
+            <a:graphic xmlns:a="http://schemas.openxmlformats.org/drawingml/2006/main">
+              <a:graphicData uri="http://schemas.openxmlformats.org/drawingml/2006/picture">
+                <pic:pic xmlns:pic="http://schemas.openxmlformats.org/drawingml/2006/picture">
+                  <pic:nvPicPr>
+                    <pic:cNvPr id="0" name="" descr=""/>
+                    <pic:cNvPicPr>
+                      <a:picLocks noChangeAspect="1" noChangeArrowheads="1"/>
+                    </pic:cNvPicPr>
+                  </pic:nvPicPr>
+                  <pic:blipFill>
+                    <a:blip r:embed="rId9" cstate="none"/>
+                    <a:srcRect/>
+                    <a:stretch>
+                      <a:fillRect/>
+                    </a:stretch>
+                  </pic:blipFill>
+                  <pic:spPr bwMode="auto">
+                    <a:xfrm>
+                      <a:off x="0" y="0"/>
+                      <a:ext cx="6096000" cy="1790700"/>
+                    </a:xfrm>
+                    <a:prstGeom prst="rect">
+                      <a:avLst/>
+                    </a:prstGeom>
+                  </pic:spPr>
+                </pic:pic>
+              </a:graphicData>
+            </a:graphic>
+          </wp:inline>
+        </w:drawing>
+      </w:r>
+    </w:p>
+    <w:p>
+      <w:pPr>
+        <w:spacing w:after="120"/>
+        <w:jc w:val="center"/>
+      </w:pPr>
+      <w:r>
+        <w:rPr>
+          <w:i/>
+          <w:iCs/>
+          <w:color w:val="5A6880"/>
+          <w:sz w:val="16"/>
+          <w:szCs w:val="16"/>
+        </w:rPr>
+        <w:t xml:space="preserve">Captured live from the deployed app (demo data, anchor 2026-07-14).</w:t>
+      </w:r>
+    </w:p>
+    <w:p>
+      <w:pPr>
         <w:spacing w:after="80"/>
         <w:ind w:left="200"/>
       </w:pPr>
@@ -724,6 +1261,68 @@
           <w:color w:val="2E5BFF"/>
         </w:rPr>
         <w:t xml:space="preserve">Sales by size vs forecast by size (bar + curve overlay)</w:t>
+      </w:r>
+    </w:p>
+    <w:p>
+      <w:pPr>
+        <w:spacing w:after="40" w:before="40"/>
+        <w:jc w:val="center"/>
+      </w:pPr>
+      <w:r>
+        <w:drawing>
+          <wp:inline distT="0" distB="0" distL="0" distR="0">
+            <wp:extent cx="6096000" cy="1790700"/>
+            <wp:effectExtent t="0" r="0" b="0" l="0"/>
+            <wp:docPr id="1" name="" descr="" title=""/>
+            <wp:cNvGraphicFramePr>
+              <a:graphicFrameLocks xmlns:a="http://schemas.openxmlformats.org/drawingml/2006/main" noChangeAspect="1"/>
+            </wp:cNvGraphicFramePr>
+            <a:graphic xmlns:a="http://schemas.openxmlformats.org/drawingml/2006/main">
+              <a:graphicData uri="http://schemas.openxmlformats.org/drawingml/2006/picture">
+                <pic:pic xmlns:pic="http://schemas.openxmlformats.org/drawingml/2006/picture">
+                  <pic:nvPicPr>
+                    <pic:cNvPr id="0" name="" descr=""/>
+                    <pic:cNvPicPr>
+                      <a:picLocks noChangeAspect="1" noChangeArrowheads="1"/>
+                    </pic:cNvPicPr>
+                  </pic:nvPicPr>
+                  <pic:blipFill>
+                    <a:blip r:embed="rId10" cstate="none"/>
+                    <a:srcRect/>
+                    <a:stretch>
+                      <a:fillRect/>
+                    </a:stretch>
+                  </pic:blipFill>
+                  <pic:spPr bwMode="auto">
+                    <a:xfrm>
+                      <a:off x="0" y="0"/>
+                      <a:ext cx="6096000" cy="1790700"/>
+                    </a:xfrm>
+                    <a:prstGeom prst="rect">
+                      <a:avLst/>
+                    </a:prstGeom>
+                  </pic:spPr>
+                </pic:pic>
+              </a:graphicData>
+            </a:graphic>
+          </wp:inline>
+        </w:drawing>
+      </w:r>
+    </w:p>
+    <w:p>
+      <w:pPr>
+        <w:spacing w:after="120"/>
+        <w:jc w:val="center"/>
+      </w:pPr>
+      <w:r>
+        <w:rPr>
+          <w:i/>
+          <w:iCs/>
+          <w:color w:val="5A6880"/>
+          <w:sz w:val="16"/>
+          <w:szCs w:val="16"/>
+        </w:rPr>
+        <w:t xml:space="preserve">Captured live from the deployed app (demo data, anchor 2026-07-14).</w:t>
       </w:r>
     </w:p>
     <w:p>
@@ -827,6 +1426,123 @@
         <w:t xml:space="preserve">Continuous replenishment review: what the engine wants to do (the queue), where the network is off plan (the map), and the evidence that lead times — not demand — are the root cause of most stockouts.</w:t>
       </w:r>
     </w:p>
+    <w:tbl>
+      <w:tblPr>
+        <w:tblW w:type="dxa" w:w="9720"/>
+        <w:tblBorders>
+          <w:top w:val="single" w:color="C9D6EC" w:sz="4"/>
+          <w:left w:val="single" w:color="2E5BFF" w:sz="24"/>
+          <w:bottom w:val="single" w:color="C9D6EC" w:sz="4"/>
+          <w:right w:val="single" w:color="C9D6EC" w:sz="4"/>
+          <w:insideH w:val="none"/>
+          <w:insideV w:val="none"/>
+        </w:tblBorders>
+      </w:tblPr>
+      <w:tblGrid>
+        <w:gridCol w:w="9720"/>
+      </w:tblGrid>
+      <w:tr>
+        <w:tc>
+          <w:tcPr>
+            <w:tcW w:type="dxa" w:w="9720"/>
+            <w:shd w:fill="EEF3FF" w:val="clear"/>
+            <w:tcMar>
+              <w:top w:type="dxa" w:w="140"/>
+              <w:left w:type="dxa" w:w="220"/>
+              <w:bottom w:type="dxa" w:w="60"/>
+              <w:right w:type="dxa" w:w="220"/>
+            </w:tcMar>
+          </w:tcPr>
+          <w:p>
+            <w:pPr>
+              <w:spacing w:after="100"/>
+            </w:pPr>
+            <w:r>
+              <w:rPr>
+                <w:b/>
+                <w:bCs/>
+                <w:caps/>
+                <w:color w:val="2E5BFF"/>
+                <w:sz w:val="18"/>
+                <w:szCs w:val="18"/>
+              </w:rPr>
+              <w:t xml:space="preserve">FOR THE SOLUTIONSET TEAM — internal background, not client-facing</w:t>
+            </w:r>
+          </w:p>
+          <w:p>
+            <w:pPr>
+              <w:spacing w:after="80"/>
+            </w:pPr>
+            <w:r>
+              <w:rPr>
+                <w:b/>
+                <w:bCs/>
+                <w:color w:val="1F2A44"/>
+                <w:sz w:val="19"/>
+                <w:szCs w:val="19"/>
+              </w:rPr>
+              <w:t xml:space="preserve">Concepts to know: </w:t>
+            </w:r>
+            <w:r>
+              <w:rPr>
+                <w:sz w:val="19"/>
+                <w:szCs w:val="19"/>
+              </w:rPr>
+              <w:t xml:space="preserve">Replenishment = automatically re-buying core items as they sell, usually via a reorder point (ROP): when projected stock crosses a threshold, the system suggests an order. A 'size run' is the set of sizes a store carries for one style/color; a run is 'broken' when sizes are missing — customers walk when their size is gone even if the rack looks full. 'Transfer-first' means moving stock from an overstocked sister store before buying new. P50/P90 lead times = the median and the 90th-percentile (bad-day) observed delivery times.</w:t>
+            </w:r>
+          </w:p>
+          <w:p>
+            <w:pPr>
+              <w:spacing w:after="80"/>
+            </w:pPr>
+            <w:r>
+              <w:rPr>
+                <w:b/>
+                <w:bCs/>
+                <w:color w:val="1F2A44"/>
+                <w:sz w:val="19"/>
+                <w:szCs w:val="19"/>
+              </w:rPr>
+              <w:t xml:space="preserve">Client need: </w:t>
+            </w:r>
+            <w:r>
+              <w:rPr>
+                <w:sz w:val="19"/>
+                <w:szCs w:val="19"/>
+              </w:rPr>
+              <w:t xml:space="preserve">Replenishment is 80% of WorkWorld's volume and today it's memory and spreadsheets. Their real killer is invisible: quoted vendor lead times are fiction, so orders placed 'on time' by the quote arrive late, and core sizes break. The two lead-time charts exist to prove this with data, because it's the claim buyers push back on hardest.</w:t>
+            </w:r>
+          </w:p>
+          <w:p>
+            <w:pPr>
+              <w:spacing w:after="80"/>
+            </w:pPr>
+            <w:r>
+              <w:rPr>
+                <w:b/>
+                <w:bCs/>
+                <w:color w:val="1F2A44"/>
+                <w:sz w:val="19"/>
+                <w:szCs w:val="19"/>
+              </w:rPr>
+              <w:t xml:space="preserve">What to internalize: </w:t>
+            </w:r>
+            <w:r>
+              <w:rPr>
+                <w:sz w:val="19"/>
+                <w:szCs w:val="19"/>
+              </w:rPr>
+              <w:t xml:space="preserve">The engine's actions are deliberately conservative — it suggests, a buyer approves. When demoing, click a red store on the map; the drill-down making variance concrete ("this store, this brand, these sizes") is what sticks.</w:t>
+            </w:r>
+          </w:p>
+        </w:tc>
+      </w:tr>
+    </w:tbl>
+    <w:p>
+      <w:pPr>
+        <w:spacing w:after="120"/>
+      </w:pPr>
+    </w:p>
     <w:p>
       <w:pPr>
         <w:pStyle w:val="Heading2"/>
@@ -922,6 +1638,68 @@
     </w:p>
     <w:p>
       <w:pPr>
+        <w:spacing w:after="40" w:before="40"/>
+        <w:jc w:val="center"/>
+      </w:pPr>
+      <w:r>
+        <w:drawing>
+          <wp:inline distT="0" distB="0" distL="0" distR="0">
+            <wp:extent cx="3810000" cy="3514725"/>
+            <wp:effectExtent t="0" r="0" b="0" l="0"/>
+            <wp:docPr id="1" name="" descr="" title=""/>
+            <wp:cNvGraphicFramePr>
+              <a:graphicFrameLocks xmlns:a="http://schemas.openxmlformats.org/drawingml/2006/main" noChangeAspect="1"/>
+            </wp:cNvGraphicFramePr>
+            <a:graphic xmlns:a="http://schemas.openxmlformats.org/drawingml/2006/main">
+              <a:graphicData uri="http://schemas.openxmlformats.org/drawingml/2006/picture">
+                <pic:pic xmlns:pic="http://schemas.openxmlformats.org/drawingml/2006/picture">
+                  <pic:nvPicPr>
+                    <pic:cNvPr id="0" name="" descr=""/>
+                    <pic:cNvPicPr>
+                      <a:picLocks noChangeAspect="1" noChangeArrowheads="1"/>
+                    </pic:cNvPicPr>
+                  </pic:nvPicPr>
+                  <pic:blipFill>
+                    <a:blip r:embed="rId11" cstate="none"/>
+                    <a:srcRect/>
+                    <a:stretch>
+                      <a:fillRect/>
+                    </a:stretch>
+                  </pic:blipFill>
+                  <pic:spPr bwMode="auto">
+                    <a:xfrm>
+                      <a:off x="0" y="0"/>
+                      <a:ext cx="3810000" cy="3514725"/>
+                    </a:xfrm>
+                    <a:prstGeom prst="rect">
+                      <a:avLst/>
+                    </a:prstGeom>
+                  </pic:spPr>
+                </pic:pic>
+              </a:graphicData>
+            </a:graphic>
+          </wp:inline>
+        </w:drawing>
+      </w:r>
+    </w:p>
+    <w:p>
+      <w:pPr>
+        <w:spacing w:after="120"/>
+        <w:jc w:val="center"/>
+      </w:pPr>
+      <w:r>
+        <w:rPr>
+          <w:i/>
+          <w:iCs/>
+          <w:color w:val="5A6880"/>
+          <w:sz w:val="16"/>
+          <w:szCs w:val="16"/>
+        </w:rPr>
+        <w:t xml:space="preserve">Captured live from the deployed app (demo data, anchor 2026-07-14).</w:t>
+      </w:r>
+    </w:p>
+    <w:p>
+      <w:pPr>
         <w:spacing w:after="80"/>
         <w:ind w:left="200"/>
       </w:pPr>
@@ -940,7 +1718,7 @@
           <w:sz w:val="20"/>
           <w:szCs w:val="20"/>
         </w:rPr>
-        <w:t xml:space="preserve">All 38 stores on a west-coast map. Pick a metric — sales vs plan variance, stockout positions, meat-size breaks, or lost sales dollars — and slice by category/brand/size. Bubble size = magnitude; green is over plan, red under. Click any store and the right panel breaks its variance down. This is the DM's Monday-morning view.</w:t>
+        <w:t xml:space="preserve">All stores on a west-coast map. Pick a metric — sales vs plan variance, stockout positions, meat-size breaks, or lost sales dollars — and slice by category/brand/size. Bubble size = magnitude; green is over plan, red under. Click any store and the right panel breaks its variance down. This is the DM's Monday-morning view.</w:t>
       </w:r>
     </w:p>
     <w:p>
@@ -1003,6 +1781,68 @@
     </w:p>
     <w:p>
       <w:pPr>
+        <w:spacing w:after="40" w:before="40"/>
+        <w:jc w:val="center"/>
+      </w:pPr>
+      <w:r>
+        <w:drawing>
+          <wp:inline distT="0" distB="0" distL="0" distR="0">
+            <wp:extent cx="5267325" cy="2667000"/>
+            <wp:effectExtent t="0" r="0" b="0" l="0"/>
+            <wp:docPr id="1" name="" descr="" title=""/>
+            <wp:cNvGraphicFramePr>
+              <a:graphicFrameLocks xmlns:a="http://schemas.openxmlformats.org/drawingml/2006/main" noChangeAspect="1"/>
+            </wp:cNvGraphicFramePr>
+            <a:graphic xmlns:a="http://schemas.openxmlformats.org/drawingml/2006/main">
+              <a:graphicData uri="http://schemas.openxmlformats.org/drawingml/2006/picture">
+                <pic:pic xmlns:pic="http://schemas.openxmlformats.org/drawingml/2006/picture">
+                  <pic:nvPicPr>
+                    <pic:cNvPr id="0" name="" descr=""/>
+                    <pic:cNvPicPr>
+                      <a:picLocks noChangeAspect="1" noChangeArrowheads="1"/>
+                    </pic:cNvPicPr>
+                  </pic:nvPicPr>
+                  <pic:blipFill>
+                    <a:blip r:embed="rId12" cstate="none"/>
+                    <a:srcRect/>
+                    <a:stretch>
+                      <a:fillRect/>
+                    </a:stretch>
+                  </pic:blipFill>
+                  <pic:spPr bwMode="auto">
+                    <a:xfrm>
+                      <a:off x="0" y="0"/>
+                      <a:ext cx="5267325" cy="2667000"/>
+                    </a:xfrm>
+                    <a:prstGeom prst="rect">
+                      <a:avLst/>
+                    </a:prstGeom>
+                  </pic:spPr>
+                </pic:pic>
+              </a:graphicData>
+            </a:graphic>
+          </wp:inline>
+        </w:drawing>
+      </w:r>
+    </w:p>
+    <w:p>
+      <w:pPr>
+        <w:spacing w:after="120"/>
+        <w:jc w:val="center"/>
+      </w:pPr>
+      <w:r>
+        <w:rPr>
+          <w:i/>
+          <w:iCs/>
+          <w:color w:val="5A6880"/>
+          <w:sz w:val="16"/>
+          <w:szCs w:val="16"/>
+        </w:rPr>
+        <w:t xml:space="preserve">Captured live from the deployed app (demo data, anchor 2026-07-14).</w:t>
+      </w:r>
+    </w:p>
+    <w:p>
+      <w:pPr>
         <w:spacing w:after="80"/>
         <w:ind w:left="200"/>
       </w:pPr>
@@ -1084,6 +1924,68 @@
     </w:p>
     <w:p>
       <w:pPr>
+        <w:spacing w:after="40" w:before="40"/>
+        <w:jc w:val="center"/>
+      </w:pPr>
+      <w:r>
+        <w:drawing>
+          <wp:inline distT="0" distB="0" distL="0" distR="0">
+            <wp:extent cx="5267325" cy="2667000"/>
+            <wp:effectExtent t="0" r="0" b="0" l="0"/>
+            <wp:docPr id="1" name="" descr="" title=""/>
+            <wp:cNvGraphicFramePr>
+              <a:graphicFrameLocks xmlns:a="http://schemas.openxmlformats.org/drawingml/2006/main" noChangeAspect="1"/>
+            </wp:cNvGraphicFramePr>
+            <a:graphic xmlns:a="http://schemas.openxmlformats.org/drawingml/2006/main">
+              <a:graphicData uri="http://schemas.openxmlformats.org/drawingml/2006/picture">
+                <pic:pic xmlns:pic="http://schemas.openxmlformats.org/drawingml/2006/picture">
+                  <pic:nvPicPr>
+                    <pic:cNvPr id="0" name="" descr=""/>
+                    <pic:cNvPicPr>
+                      <a:picLocks noChangeAspect="1" noChangeArrowheads="1"/>
+                    </pic:cNvPicPr>
+                  </pic:nvPicPr>
+                  <pic:blipFill>
+                    <a:blip r:embed="rId13" cstate="none"/>
+                    <a:srcRect/>
+                    <a:stretch>
+                      <a:fillRect/>
+                    </a:stretch>
+                  </pic:blipFill>
+                  <pic:spPr bwMode="auto">
+                    <a:xfrm>
+                      <a:off x="0" y="0"/>
+                      <a:ext cx="5267325" cy="2667000"/>
+                    </a:xfrm>
+                    <a:prstGeom prst="rect">
+                      <a:avLst/>
+                    </a:prstGeom>
+                  </pic:spPr>
+                </pic:pic>
+              </a:graphicData>
+            </a:graphic>
+          </wp:inline>
+        </w:drawing>
+      </w:r>
+    </w:p>
+    <w:p>
+      <w:pPr>
+        <w:spacing w:after="120"/>
+        <w:jc w:val="center"/>
+      </w:pPr>
+      <w:r>
+        <w:rPr>
+          <w:i/>
+          <w:iCs/>
+          <w:color w:val="5A6880"/>
+          <w:sz w:val="16"/>
+          <w:szCs w:val="16"/>
+        </w:rPr>
+        <w:t xml:space="preserve">Captured live from the deployed app (demo data, anchor 2026-07-14).</w:t>
+      </w:r>
+    </w:p>
+    <w:p>
+      <w:pPr>
         <w:spacing w:after="80"/>
         <w:ind w:left="200"/>
       </w:pPr>
@@ -1161,6 +2063,68 @@
           <w:color w:val="2E5BFF"/>
         </w:rPr>
         <w:t xml:space="preserve">Size-run health by store (stacked bar)</w:t>
+      </w:r>
+    </w:p>
+    <w:p>
+      <w:pPr>
+        <w:spacing w:after="40" w:before="40"/>
+        <w:jc w:val="center"/>
+      </w:pPr>
+      <w:r>
+        <w:drawing>
+          <wp:inline distT="0" distB="0" distL="0" distR="0">
+            <wp:extent cx="5267325" cy="2667000"/>
+            <wp:effectExtent t="0" r="0" b="0" l="0"/>
+            <wp:docPr id="1" name="" descr="" title=""/>
+            <wp:cNvGraphicFramePr>
+              <a:graphicFrameLocks xmlns:a="http://schemas.openxmlformats.org/drawingml/2006/main" noChangeAspect="1"/>
+            </wp:cNvGraphicFramePr>
+            <a:graphic xmlns:a="http://schemas.openxmlformats.org/drawingml/2006/main">
+              <a:graphicData uri="http://schemas.openxmlformats.org/drawingml/2006/picture">
+                <pic:pic xmlns:pic="http://schemas.openxmlformats.org/drawingml/2006/picture">
+                  <pic:nvPicPr>
+                    <pic:cNvPr id="0" name="" descr=""/>
+                    <pic:cNvPicPr>
+                      <a:picLocks noChangeAspect="1" noChangeArrowheads="1"/>
+                    </pic:cNvPicPr>
+                  </pic:nvPicPr>
+                  <pic:blipFill>
+                    <a:blip r:embed="rId14" cstate="none"/>
+                    <a:srcRect/>
+                    <a:stretch>
+                      <a:fillRect/>
+                    </a:stretch>
+                  </pic:blipFill>
+                  <pic:spPr bwMode="auto">
+                    <a:xfrm>
+                      <a:off x="0" y="0"/>
+                      <a:ext cx="5267325" cy="2667000"/>
+                    </a:xfrm>
+                    <a:prstGeom prst="rect">
+                      <a:avLst/>
+                    </a:prstGeom>
+                  </pic:spPr>
+                </pic:pic>
+              </a:graphicData>
+            </a:graphic>
+          </wp:inline>
+        </w:drawing>
+      </w:r>
+    </w:p>
+    <w:p>
+      <w:pPr>
+        <w:spacing w:after="120"/>
+        <w:jc w:val="center"/>
+      </w:pPr>
+      <w:r>
+        <w:rPr>
+          <w:i/>
+          <w:iCs/>
+          <w:color w:val="5A6880"/>
+          <w:sz w:val="16"/>
+          <w:szCs w:val="16"/>
+        </w:rPr>
+        <w:t xml:space="preserve">Captured live from the deployed app (demo data, anchor 2026-07-14).</w:t>
       </w:r>
     </w:p>
     <w:p>
@@ -1345,6 +2309,123 @@
         <w:t xml:space="preserve">You can't plan around what a vendor can't ship. This module tracks what each vendor reports as available-to-sell and — just as important — how much of it we can actually use, via the item cross-reference match rate.</w:t>
       </w:r>
     </w:p>
+    <w:tbl>
+      <w:tblPr>
+        <w:tblW w:type="dxa" w:w="9720"/>
+        <w:tblBorders>
+          <w:top w:val="single" w:color="C9D6EC" w:sz="4"/>
+          <w:left w:val="single" w:color="2E5BFF" w:sz="24"/>
+          <w:bottom w:val="single" w:color="C9D6EC" w:sz="4"/>
+          <w:right w:val="single" w:color="C9D6EC" w:sz="4"/>
+          <w:insideH w:val="none"/>
+          <w:insideV w:val="none"/>
+        </w:tblBorders>
+      </w:tblPr>
+      <w:tblGrid>
+        <w:gridCol w:w="9720"/>
+      </w:tblGrid>
+      <w:tr>
+        <w:tc>
+          <w:tcPr>
+            <w:tcW w:type="dxa" w:w="9720"/>
+            <w:shd w:fill="EEF3FF" w:val="clear"/>
+            <w:tcMar>
+              <w:top w:type="dxa" w:w="140"/>
+              <w:left w:type="dxa" w:w="220"/>
+              <w:bottom w:type="dxa" w:w="60"/>
+              <w:right w:type="dxa" w:w="220"/>
+            </w:tcMar>
+          </w:tcPr>
+          <w:p>
+            <w:pPr>
+              <w:spacing w:after="100"/>
+            </w:pPr>
+            <w:r>
+              <w:rPr>
+                <w:b/>
+                <w:bCs/>
+                <w:caps/>
+                <w:color w:val="2E5BFF"/>
+                <w:sz w:val="18"/>
+                <w:szCs w:val="18"/>
+              </w:rPr>
+              <w:t xml:space="preserve">FOR THE SOLUTIONSET TEAM — internal background, not client-facing</w:t>
+            </w:r>
+          </w:p>
+          <w:p>
+            <w:pPr>
+              <w:spacing w:after="80"/>
+            </w:pPr>
+            <w:r>
+              <w:rPr>
+                <w:b/>
+                <w:bCs/>
+                <w:color w:val="1F2A44"/>
+                <w:sz w:val="19"/>
+                <w:szCs w:val="19"/>
+              </w:rPr>
+              <w:t xml:space="preserve">Concepts to know: </w:t>
+            </w:r>
+            <w:r>
+              <w:rPr>
+                <w:sz w:val="19"/>
+                <w:szCs w:val="19"/>
+              </w:rPr>
+              <w:t xml:space="preserve">ATS = available to sell: the inventory a vendor can actually ship you right now. EDI 846 is the standard electronic 'inventory advice' document sophisticated vendors transmit; smaller vendors post spreadsheets on portals or email them. An item cross-reference (crossref) maps each vendor's SKU numbering to ours — without a match, a vendor's availability row is useless to the planning engine.</w:t>
+            </w:r>
+          </w:p>
+          <w:p>
+            <w:pPr>
+              <w:spacing w:after="80"/>
+            </w:pPr>
+            <w:r>
+              <w:rPr>
+                <w:b/>
+                <w:bCs/>
+                <w:color w:val="1F2A44"/>
+                <w:sz w:val="19"/>
+                <w:szCs w:val="19"/>
+              </w:rPr>
+              <w:t xml:space="preserve">Client need: </w:t>
+            </w:r>
+            <w:r>
+              <w:rPr>
+                <w:sz w:val="19"/>
+                <w:szCs w:val="19"/>
+              </w:rPr>
+              <w:t xml:space="preserve">WorkWorld orders into vendor stockouts today and finds out weeks later via short shipments. Even partial ATS visibility (their two biggest vendors are EDI-capable) prevents the worst of it. The crossref match rate doubles as an implementation health metric — it's the unglamorous data work that makes the shiny modules trustworthy.</w:t>
+            </w:r>
+          </w:p>
+          <w:p>
+            <w:pPr>
+              <w:spacing w:after="80"/>
+            </w:pPr>
+            <w:r>
+              <w:rPr>
+                <w:b/>
+                <w:bCs/>
+                <w:color w:val="1F2A44"/>
+                <w:sz w:val="19"/>
+                <w:szCs w:val="19"/>
+              </w:rPr>
+              <w:t xml:space="preserve">What to internalize: </w:t>
+            </w:r>
+            <w:r>
+              <w:rPr>
+                <w:sz w:val="19"/>
+                <w:szCs w:val="19"/>
+              </w:rPr>
+              <w:t xml:space="preserve">The tiering (A: EDI / B: portal / C: parsed email) is our standard vendor-integration playbook and a realistic rollout promise — lead with honesty here; it builds trust for the bigger claims elsewhere.</w:t>
+            </w:r>
+          </w:p>
+        </w:tc>
+      </w:tr>
+    </w:tbl>
+    <w:p>
+      <w:pPr>
+        <w:spacing w:after="120"/>
+      </w:pPr>
+    </w:p>
     <w:p>
       <w:pPr>
         <w:pStyle w:val="Heading2"/>
@@ -1539,6 +2620,123 @@
         <w:t xml:space="preserve">Closeouts, tier breaks, SMUs, preseason books — offers with deadlines. Each is scored so the buyer weighs the margin uplift against the real cost of an opportunity buy: weeks of supply and broken-run risk.</w:t>
       </w:r>
     </w:p>
+    <w:tbl>
+      <w:tblPr>
+        <w:tblW w:type="dxa" w:w="9720"/>
+        <w:tblBorders>
+          <w:top w:val="single" w:color="C9D6EC" w:sz="4"/>
+          <w:left w:val="single" w:color="2E5BFF" w:sz="24"/>
+          <w:bottom w:val="single" w:color="C9D6EC" w:sz="4"/>
+          <w:right w:val="single" w:color="C9D6EC" w:sz="4"/>
+          <w:insideH w:val="none"/>
+          <w:insideV w:val="none"/>
+        </w:tblBorders>
+      </w:tblPr>
+      <w:tblGrid>
+        <w:gridCol w:w="9720"/>
+      </w:tblGrid>
+      <w:tr>
+        <w:tc>
+          <w:tcPr>
+            <w:tcW w:type="dxa" w:w="9720"/>
+            <w:shd w:fill="EEF3FF" w:val="clear"/>
+            <w:tcMar>
+              <w:top w:type="dxa" w:w="140"/>
+              <w:left w:type="dxa" w:w="220"/>
+              <w:bottom w:type="dxa" w:w="60"/>
+              <w:right w:type="dxa" w:w="220"/>
+            </w:tcMar>
+          </w:tcPr>
+          <w:p>
+            <w:pPr>
+              <w:spacing w:after="100"/>
+            </w:pPr>
+            <w:r>
+              <w:rPr>
+                <w:b/>
+                <w:bCs/>
+                <w:caps/>
+                <w:color w:val="2E5BFF"/>
+                <w:sz w:val="18"/>
+                <w:szCs w:val="18"/>
+              </w:rPr>
+              <w:t xml:space="preserve">FOR THE SOLUTIONSET TEAM — internal background, not client-facing</w:t>
+            </w:r>
+          </w:p>
+          <w:p>
+            <w:pPr>
+              <w:spacing w:after="80"/>
+            </w:pPr>
+            <w:r>
+              <w:rPr>
+                <w:b/>
+                <w:bCs/>
+                <w:color w:val="1F2A44"/>
+                <w:sz w:val="19"/>
+                <w:szCs w:val="19"/>
+              </w:rPr>
+              <w:t xml:space="preserve">Concepts to know: </w:t>
+            </w:r>
+            <w:r>
+              <w:rPr>
+                <w:sz w:val="19"/>
+                <w:szCs w:val="19"/>
+              </w:rPr>
+              <w:t xml:space="preserve">An opportunity buy is inventory bought because the deal is good, not because demand asked for it: closeouts (vendor clearing discontinued goods), tier breaks (order 288 units instead of 250 and the whole order gets a lower price bracket), SMUs (special make-ups — product made exclusively for you), preseason books (order early, pay less). Weeks of supply (WOS) = how long the committed quantity lasts at current selling rate — the standard overstock risk measure.</w:t>
+            </w:r>
+          </w:p>
+          <w:p>
+            <w:pPr>
+              <w:spacing w:after="80"/>
+            </w:pPr>
+            <w:r>
+              <w:rPr>
+                <w:b/>
+                <w:bCs/>
+                <w:color w:val="1F2A44"/>
+                <w:sz w:val="19"/>
+                <w:szCs w:val="19"/>
+              </w:rPr>
+              <w:t xml:space="preserve">Client need: </w:t>
+            </w:r>
+            <w:r>
+              <w:rPr>
+                <w:sz w:val="19"/>
+                <w:szCs w:val="19"/>
+              </w:rPr>
+              <w:t xml:space="preserve">Vendor reps constantly dangle deals and today WorkWorld decides on gut feel. The trap: a 20% discount that leaves 30 weeks of supply becomes a markdown problem that eats the discount twice over. The client knows they've been burned this way; this module gives the gut feel a denominator.</w:t>
+            </w:r>
+          </w:p>
+          <w:p>
+            <w:pPr>
+              <w:spacing w:after="80"/>
+            </w:pPr>
+            <w:r>
+              <w:rPr>
+                <w:b/>
+                <w:bCs/>
+                <w:color w:val="1F2A44"/>
+                <w:sz w:val="19"/>
+                <w:szCs w:val="19"/>
+              </w:rPr>
+              <w:t xml:space="preserve">What to internalize: </w:t>
+            </w:r>
+            <w:r>
+              <w:rPr>
+                <w:sz w:val="19"/>
+                <w:szCs w:val="19"/>
+              </w:rPr>
+              <w:t xml:space="preserve">This is the smallest module but often the most persuasive to owners — it's directly about cash. The AI recommendation column is a good place to explain our AI posture: the machine drafts the reasoning, a named human accepts or declines.</w:t>
+            </w:r>
+          </w:p>
+        </w:tc>
+      </w:tr>
+    </w:tbl>
+    <w:p>
+      <w:pPr>
+        <w:spacing w:after="120"/>
+      </w:pPr>
+    </w:p>
     <w:p>
       <w:pPr>
         <w:pStyle w:val="Heading2"/>
@@ -1733,6 +2931,123 @@
         <w:t xml:space="preserve">The longest step of the monthly close, turned from a project into a queue. Master PO → per-store mini-POs → store receivers → vendor invoices → master statements, matched at line level nightly.</w:t>
       </w:r>
     </w:p>
+    <w:tbl>
+      <w:tblPr>
+        <w:tblW w:type="dxa" w:w="9720"/>
+        <w:tblBorders>
+          <w:top w:val="single" w:color="C9D6EC" w:sz="4"/>
+          <w:left w:val="single" w:color="2E5BFF" w:sz="24"/>
+          <w:bottom w:val="single" w:color="C9D6EC" w:sz="4"/>
+          <w:right w:val="single" w:color="C9D6EC" w:sz="4"/>
+          <w:insideH w:val="none"/>
+          <w:insideV w:val="none"/>
+        </w:tblBorders>
+      </w:tblPr>
+      <w:tblGrid>
+        <w:gridCol w:w="9720"/>
+      </w:tblGrid>
+      <w:tr>
+        <w:tc>
+          <w:tcPr>
+            <w:tcW w:type="dxa" w:w="9720"/>
+            <w:shd w:fill="EEF3FF" w:val="clear"/>
+            <w:tcMar>
+              <w:top w:type="dxa" w:w="140"/>
+              <w:left w:type="dxa" w:w="220"/>
+              <w:bottom w:type="dxa" w:w="60"/>
+              <w:right w:type="dxa" w:w="220"/>
+            </w:tcMar>
+          </w:tcPr>
+          <w:p>
+            <w:pPr>
+              <w:spacing w:after="100"/>
+            </w:pPr>
+            <w:r>
+              <w:rPr>
+                <w:b/>
+                <w:bCs/>
+                <w:caps/>
+                <w:color w:val="2E5BFF"/>
+                <w:sz w:val="18"/>
+                <w:szCs w:val="18"/>
+              </w:rPr>
+              <w:t xml:space="preserve">FOR THE SOLUTIONSET TEAM — internal background, not client-facing</w:t>
+            </w:r>
+          </w:p>
+          <w:p>
+            <w:pPr>
+              <w:spacing w:after="80"/>
+            </w:pPr>
+            <w:r>
+              <w:rPr>
+                <w:b/>
+                <w:bCs/>
+                <w:color w:val="1F2A44"/>
+                <w:sz w:val="19"/>
+                <w:szCs w:val="19"/>
+              </w:rPr>
+              <w:t xml:space="preserve">Concepts to know: </w:t>
+            </w:r>
+            <w:r>
+              <w:rPr>
+                <w:sz w:val="19"/>
+                <w:szCs w:val="19"/>
+              </w:rPr>
+              <w:t xml:space="preserve">3-way match = comparing what was ordered (PO) vs what arrived (receiver) vs what was billed (invoice), line by line; a mismatch is an 'exception' (price variance, short ship, freight surprise). Because vendors ship direct to each of 38 stores, one master PO explodes into 38 mini-POs, 38 receivers, and many invoices rolled into a monthly vendor statement — the document tree. A debit memo is the paper that claws money back from a vendor. EDI 855 is the vendor's order acknowledgment.</w:t>
+            </w:r>
+          </w:p>
+          <w:p>
+            <w:pPr>
+              <w:spacing w:after="80"/>
+            </w:pPr>
+            <w:r>
+              <w:rPr>
+                <w:b/>
+                <w:bCs/>
+                <w:color w:val="1F2A44"/>
+                <w:sz w:val="19"/>
+                <w:szCs w:val="19"/>
+              </w:rPr>
+              <w:t xml:space="preserve">Client need: </w:t>
+            </w:r>
+            <w:r>
+              <w:rPr>
+                <w:sz w:val="19"/>
+                <w:szCs w:val="19"/>
+              </w:rPr>
+              <w:t xml:space="preserve">This is WorkWorld's single biggest pain in hours: the bookkeeper reconciles vendor statements against store paperwork manually, and the monthly close drags for weeks. It's also where the money is — unclaimed short-ships and price variances are silent margin leaks. The pitch: the machine matches everything nightly, auto-clears the clean 90%+, and humans work a queue of exceptions with AI-drafted resolutions.</w:t>
+            </w:r>
+          </w:p>
+          <w:p>
+            <w:pPr>
+              <w:spacing w:after="80"/>
+            </w:pPr>
+            <w:r>
+              <w:rPr>
+                <w:b/>
+                <w:bCs/>
+                <w:color w:val="1F2A44"/>
+                <w:sz w:val="19"/>
+                <w:szCs w:val="19"/>
+              </w:rPr>
+              <w:t xml:space="preserve">What to internalize: </w:t>
+            </w:r>
+            <w:r>
+              <w:rPr>
+                <w:sz w:val="19"/>
+                <w:szCs w:val="19"/>
+              </w:rPr>
+              <w:t xml:space="preserve">This module wins deals precisely because it's boring — it attacks a cost the client can name in dollars and hours. Learn the document tree cold: master PO → mini-PO → receiver → invoice → statement. If you can walk one buy end-to-end in the explorer without fumbling, you own the room.</w:t>
+            </w:r>
+          </w:p>
+        </w:tc>
+      </w:tr>
+    </w:tbl>
+    <w:p>
+      <w:pPr>
+        <w:spacing w:after="120"/>
+      </w:pPr>
+    </w:p>
     <w:p>
       <w:pPr>
         <w:pStyle w:val="Heading2"/>
@@ -1909,6 +3224,68 @@
     </w:p>
     <w:p>
       <w:pPr>
+        <w:spacing w:after="40" w:before="40"/>
+        <w:jc w:val="center"/>
+      </w:pPr>
+      <w:r>
+        <w:drawing>
+          <wp:inline distT="0" distB="0" distL="0" distR="0">
+            <wp:extent cx="5267325" cy="2667000"/>
+            <wp:effectExtent t="0" r="0" b="0" l="0"/>
+            <wp:docPr id="1" name="" descr="" title=""/>
+            <wp:cNvGraphicFramePr>
+              <a:graphicFrameLocks xmlns:a="http://schemas.openxmlformats.org/drawingml/2006/main" noChangeAspect="1"/>
+            </wp:cNvGraphicFramePr>
+            <a:graphic xmlns:a="http://schemas.openxmlformats.org/drawingml/2006/main">
+              <a:graphicData uri="http://schemas.openxmlformats.org/drawingml/2006/picture">
+                <pic:pic xmlns:pic="http://schemas.openxmlformats.org/drawingml/2006/picture">
+                  <pic:nvPicPr>
+                    <pic:cNvPr id="0" name="" descr=""/>
+                    <pic:cNvPicPr>
+                      <a:picLocks noChangeAspect="1" noChangeArrowheads="1"/>
+                    </pic:cNvPicPr>
+                  </pic:nvPicPr>
+                  <pic:blipFill>
+                    <a:blip r:embed="rId15" cstate="none"/>
+                    <a:srcRect/>
+                    <a:stretch>
+                      <a:fillRect/>
+                    </a:stretch>
+                  </pic:blipFill>
+                  <pic:spPr bwMode="auto">
+                    <a:xfrm>
+                      <a:off x="0" y="0"/>
+                      <a:ext cx="5267325" cy="2667000"/>
+                    </a:xfrm>
+                    <a:prstGeom prst="rect">
+                      <a:avLst/>
+                    </a:prstGeom>
+                  </pic:spPr>
+                </pic:pic>
+              </a:graphicData>
+            </a:graphic>
+          </wp:inline>
+        </w:drawing>
+      </w:r>
+    </w:p>
+    <w:p>
+      <w:pPr>
+        <w:spacing w:after="120"/>
+        <w:jc w:val="center"/>
+      </w:pPr>
+      <w:r>
+        <w:rPr>
+          <w:i/>
+          <w:iCs/>
+          <w:color w:val="5A6880"/>
+          <w:sz w:val="16"/>
+          <w:szCs w:val="16"/>
+        </w:rPr>
+        <w:t xml:space="preserve">Captured live from the deployed app (demo data, anchor 2026-07-14).</w:t>
+      </w:r>
+    </w:p>
+    <w:p>
+      <w:pPr>
         <w:spacing w:after="80"/>
         <w:ind w:left="200"/>
       </w:pPr>
@@ -1985,7 +3362,69 @@
         <w:rPr>
           <w:color w:val="2E5BFF"/>
         </w:rPr>
-        <w:t xml:space="preserve">Open exception aging &amp; root cause (bar + donut)</w:t>
+        <w:t xml:space="preserve">Open exception aging (bar)</w:t>
+      </w:r>
+    </w:p>
+    <w:p>
+      <w:pPr>
+        <w:spacing w:after="40" w:before="40"/>
+        <w:jc w:val="center"/>
+      </w:pPr>
+      <w:r>
+        <w:drawing>
+          <wp:inline distT="0" distB="0" distL="0" distR="0">
+            <wp:extent cx="2857500" cy="2286000"/>
+            <wp:effectExtent t="0" r="0" b="0" l="0"/>
+            <wp:docPr id="1" name="" descr="" title=""/>
+            <wp:cNvGraphicFramePr>
+              <a:graphicFrameLocks xmlns:a="http://schemas.openxmlformats.org/drawingml/2006/main" noChangeAspect="1"/>
+            </wp:cNvGraphicFramePr>
+            <a:graphic xmlns:a="http://schemas.openxmlformats.org/drawingml/2006/main">
+              <a:graphicData uri="http://schemas.openxmlformats.org/drawingml/2006/picture">
+                <pic:pic xmlns:pic="http://schemas.openxmlformats.org/drawingml/2006/picture">
+                  <pic:nvPicPr>
+                    <pic:cNvPr id="0" name="" descr=""/>
+                    <pic:cNvPicPr>
+                      <a:picLocks noChangeAspect="1" noChangeArrowheads="1"/>
+                    </pic:cNvPicPr>
+                  </pic:nvPicPr>
+                  <pic:blipFill>
+                    <a:blip r:embed="rId16" cstate="none"/>
+                    <a:srcRect/>
+                    <a:stretch>
+                      <a:fillRect/>
+                    </a:stretch>
+                  </pic:blipFill>
+                  <pic:spPr bwMode="auto">
+                    <a:xfrm>
+                      <a:off x="0" y="0"/>
+                      <a:ext cx="2857500" cy="2286000"/>
+                    </a:xfrm>
+                    <a:prstGeom prst="rect">
+                      <a:avLst/>
+                    </a:prstGeom>
+                  </pic:spPr>
+                </pic:pic>
+              </a:graphicData>
+            </a:graphic>
+          </wp:inline>
+        </w:drawing>
+      </w:r>
+    </w:p>
+    <w:p>
+      <w:pPr>
+        <w:spacing w:after="120"/>
+        <w:jc w:val="center"/>
+      </w:pPr>
+      <w:r>
+        <w:rPr>
+          <w:i/>
+          <w:iCs/>
+          <w:color w:val="5A6880"/>
+          <w:sz w:val="16"/>
+          <w:szCs w:val="16"/>
+        </w:rPr>
+        <w:t xml:space="preserve">Captured live from the deployed app (demo data, anchor 2026-07-14).</w:t>
       </w:r>
     </w:p>
     <w:p>
@@ -2008,7 +3447,7 @@
           <w:sz w:val="20"/>
           <w:szCs w:val="20"/>
         </w:rPr>
-        <w:t xml:space="preserve">Aging buckets (0–15 / 16–30 / 31–60 / 60+ days) for open exceptions, plus a donut of open dollars by root cause (price variance, quantity variance, freight, etc.). Old exceptions are the close-cycle killers; causes tell you what to fix upstream.</w:t>
+        <w:t xml:space="preserve">Aging buckets (0–15 / 16–30 / 31–60 / 60+ days) for open exceptions. Old exceptions are the close-cycle killers — the bars should live on the left.</w:t>
       </w:r>
     </w:p>
     <w:p>
@@ -2031,7 +3470,7 @@
           <w:sz w:val="20"/>
           <w:szCs w:val="20"/>
         </w:rPr>
-        <w:t xml:space="preserve">Age = days since invoice date; buckets computed in-app. Donut sums open variance dollars by variance type.</w:t>
+        <w:t xml:space="preserve">Age = days since invoice date; buckets computed in-app.</w:t>
       </w:r>
     </w:p>
     <w:p>
@@ -2054,7 +3493,150 @@
           <w:sz w:val="20"/>
           <w:szCs w:val="20"/>
         </w:rPr>
-        <w:t xml:space="preserve">exception_queue_v — open threeway_match rows (PendingReview / DebitMemoSent) with vendor, store, and item context.</w:t>
+        <w:t xml:space="preserve">exception_queue_v — open threeway_match rows (PendingReview / DebitMemoSent).</w:t>
+      </w:r>
+    </w:p>
+    <w:p>
+      <w:pPr>
+        <w:pStyle w:val="Heading2"/>
+        <w:spacing w:after="60" w:before="220"/>
+      </w:pPr>
+      <w:r>
+        <w:rPr>
+          <w:color w:val="2E5BFF"/>
+        </w:rPr>
+        <w:t xml:space="preserve">Open exceptions by root cause (donut)</w:t>
+      </w:r>
+    </w:p>
+    <w:p>
+      <w:pPr>
+        <w:spacing w:after="40" w:before="40"/>
+        <w:jc w:val="center"/>
+      </w:pPr>
+      <w:r>
+        <w:drawing>
+          <wp:inline distT="0" distB="0" distL="0" distR="0">
+            <wp:extent cx="2857500" cy="2286000"/>
+            <wp:effectExtent t="0" r="0" b="0" l="0"/>
+            <wp:docPr id="1" name="" descr="" title=""/>
+            <wp:cNvGraphicFramePr>
+              <a:graphicFrameLocks xmlns:a="http://schemas.openxmlformats.org/drawingml/2006/main" noChangeAspect="1"/>
+            </wp:cNvGraphicFramePr>
+            <a:graphic xmlns:a="http://schemas.openxmlformats.org/drawingml/2006/main">
+              <a:graphicData uri="http://schemas.openxmlformats.org/drawingml/2006/picture">
+                <pic:pic xmlns:pic="http://schemas.openxmlformats.org/drawingml/2006/picture">
+                  <pic:nvPicPr>
+                    <pic:cNvPr id="0" name="" descr=""/>
+                    <pic:cNvPicPr>
+                      <a:picLocks noChangeAspect="1" noChangeArrowheads="1"/>
+                    </pic:cNvPicPr>
+                  </pic:nvPicPr>
+                  <pic:blipFill>
+                    <a:blip r:embed="rId17" cstate="none"/>
+                    <a:srcRect/>
+                    <a:stretch>
+                      <a:fillRect/>
+                    </a:stretch>
+                  </pic:blipFill>
+                  <pic:spPr bwMode="auto">
+                    <a:xfrm>
+                      <a:off x="0" y="0"/>
+                      <a:ext cx="2857500" cy="2286000"/>
+                    </a:xfrm>
+                    <a:prstGeom prst="rect">
+                      <a:avLst/>
+                    </a:prstGeom>
+                  </pic:spPr>
+                </pic:pic>
+              </a:graphicData>
+            </a:graphic>
+          </wp:inline>
+        </w:drawing>
+      </w:r>
+    </w:p>
+    <w:p>
+      <w:pPr>
+        <w:spacing w:after="120"/>
+        <w:jc w:val="center"/>
+      </w:pPr>
+      <w:r>
+        <w:rPr>
+          <w:i/>
+          <w:iCs/>
+          <w:color w:val="5A6880"/>
+          <w:sz w:val="16"/>
+          <w:szCs w:val="16"/>
+        </w:rPr>
+        <w:t xml:space="preserve">Captured live from the deployed app (demo data, anchor 2026-07-14).</w:t>
+      </w:r>
+    </w:p>
+    <w:p>
+      <w:pPr>
+        <w:spacing w:after="80"/>
+        <w:ind w:left="200"/>
+      </w:pPr>
+      <w:r>
+        <w:rPr>
+          <w:b/>
+          <w:bCs/>
+          <w:color w:val="1F2A44"/>
+          <w:sz w:val="20"/>
+          <w:szCs w:val="20"/>
+        </w:rPr>
+        <w:t xml:space="preserve">Purpose —  </w:t>
+      </w:r>
+      <w:r>
+        <w:rPr>
+          <w:sz w:val="20"/>
+          <w:szCs w:val="20"/>
+        </w:rPr>
+        <w:t xml:space="preserve">Open dollars by cause — price variance, quantity variance, freight, and friends. Causes tell you what to fix upstream: chronic price variance means the vendor's price file and ours disagree (Module 7 territory).</w:t>
+      </w:r>
+    </w:p>
+    <w:p>
+      <w:pPr>
+        <w:spacing w:after="80"/>
+        <w:ind w:left="200"/>
+      </w:pPr>
+      <w:r>
+        <w:rPr>
+          <w:b/>
+          <w:bCs/>
+          <w:color w:val="1F2A44"/>
+          <w:sz w:val="20"/>
+          <w:szCs w:val="20"/>
+        </w:rPr>
+        <w:t xml:space="preserve">Logic —  </w:t>
+      </w:r>
+      <w:r>
+        <w:rPr>
+          <w:sz w:val="20"/>
+          <w:szCs w:val="20"/>
+        </w:rPr>
+        <w:t xml:space="preserve">Open variance dollars summed by variance type.</w:t>
+      </w:r>
+    </w:p>
+    <w:p>
+      <w:pPr>
+        <w:spacing w:after="80"/>
+        <w:ind w:left="200"/>
+      </w:pPr>
+      <w:r>
+        <w:rPr>
+          <w:b/>
+          <w:bCs/>
+          <w:color w:val="1F2A44"/>
+          <w:sz w:val="20"/>
+          <w:szCs w:val="20"/>
+        </w:rPr>
+        <w:t xml:space="preserve">Data —  </w:t>
+      </w:r>
+      <w:r>
+        <w:rPr>
+          <w:sz w:val="20"/>
+          <w:szCs w:val="20"/>
+        </w:rPr>
+        <w:t xml:space="preserve">exception_queue_v — same open exceptions, grouped by variance_type.</w:t>
       </w:r>
     </w:p>
     <w:p>
@@ -2251,6 +3833,123 @@
         <w:t xml:space="preserve">Vendor price files in, staged ERP updates out — with every event carrying its margin impact, its pre-buy option, and its store execution trail. Nothing touches the ERP without an approval click.</w:t>
       </w:r>
     </w:p>
+    <w:tbl>
+      <w:tblPr>
+        <w:tblW w:type="dxa" w:w="9720"/>
+        <w:tblBorders>
+          <w:top w:val="single" w:color="C9D6EC" w:sz="4"/>
+          <w:left w:val="single" w:color="2E5BFF" w:sz="24"/>
+          <w:bottom w:val="single" w:color="C9D6EC" w:sz="4"/>
+          <w:right w:val="single" w:color="C9D6EC" w:sz="4"/>
+          <w:insideH w:val="none"/>
+          <w:insideV w:val="none"/>
+        </w:tblBorders>
+      </w:tblPr>
+      <w:tblGrid>
+        <w:gridCol w:w="9720"/>
+      </w:tblGrid>
+      <w:tr>
+        <w:tc>
+          <w:tcPr>
+            <w:tcW w:type="dxa" w:w="9720"/>
+            <w:shd w:fill="EEF3FF" w:val="clear"/>
+            <w:tcMar>
+              <w:top w:type="dxa" w:w="140"/>
+              <w:left w:type="dxa" w:w="220"/>
+              <w:bottom w:type="dxa" w:w="60"/>
+              <w:right w:type="dxa" w:w="220"/>
+            </w:tcMar>
+          </w:tcPr>
+          <w:p>
+            <w:pPr>
+              <w:spacing w:after="100"/>
+            </w:pPr>
+            <w:r>
+              <w:rPr>
+                <w:b/>
+                <w:bCs/>
+                <w:caps/>
+                <w:color w:val="2E5BFF"/>
+                <w:sz w:val="18"/>
+                <w:szCs w:val="18"/>
+              </w:rPr>
+              <w:t xml:space="preserve">FOR THE SOLUTIONSET TEAM — internal background, not client-facing</w:t>
+            </w:r>
+          </w:p>
+          <w:p>
+            <w:pPr>
+              <w:spacing w:after="80"/>
+            </w:pPr>
+            <w:r>
+              <w:rPr>
+                <w:b/>
+                <w:bCs/>
+                <w:color w:val="1F2A44"/>
+                <w:sz w:val="19"/>
+                <w:szCs w:val="19"/>
+              </w:rPr>
+              <w:t xml:space="preserve">Concepts to know: </w:t>
+            </w:r>
+            <w:r>
+              <w:rPr>
+                <w:sz w:val="19"/>
+                <w:szCs w:val="19"/>
+              </w:rPr>
+              <w:t xml:space="preserve">Vendors announce cost increases via price files (EDI 832 for the sophisticated ones; PDFs and spreadsheets otherwise). The retailer then chooses whether to 'follow the retail' — raise shelf prices too — which sets the margin outcome. A pre-buy is stocking up at today's cost before an announced increase takes effect. 'Staging' means the new prices sit in a holding area until a human approves the push to the ERP; retagging is the store labor of re-labeling shelves after a price change.</w:t>
+            </w:r>
+          </w:p>
+          <w:p>
+            <w:pPr>
+              <w:spacing w:after="80"/>
+            </w:pPr>
+            <w:r>
+              <w:rPr>
+                <w:b/>
+                <w:bCs/>
+                <w:color w:val="1F2A44"/>
+                <w:sz w:val="19"/>
+                <w:szCs w:val="19"/>
+              </w:rPr>
+              <w:t xml:space="preserve">Client need: </w:t>
+            </w:r>
+            <w:r>
+              <w:rPr>
+                <w:sz w:val="19"/>
+                <w:szCs w:val="19"/>
+              </w:rPr>
+              <w:t xml:space="preserve">Price updates arrive as attachments and get keyed into the ERP by hand — sometimes late, occasionally wrong, with no record of whether stores retagged. Margin then moves without anyone deciding it should. The module's promise: every price event is explicit — impact previewed, pre-buy considered, approval logged, store execution tracked.</w:t>
+            </w:r>
+          </w:p>
+          <w:p>
+            <w:pPr>
+              <w:spacing w:after="80"/>
+            </w:pPr>
+            <w:r>
+              <w:rPr>
+                <w:b/>
+                <w:bCs/>
+                <w:color w:val="1F2A44"/>
+                <w:sz w:val="19"/>
+                <w:szCs w:val="19"/>
+              </w:rPr>
+              <w:t xml:space="preserve">What to internalize: </w:t>
+            </w:r>
+            <w:r>
+              <w:rPr>
+                <w:sz w:val="19"/>
+                <w:szCs w:val="19"/>
+              </w:rPr>
+              <w:t xml:space="preserve">The 6-weeks-of-supply guardrail on pre-buys is the module's judgment in one number: buy ahead enough to capture savings, never enough to create a markdown problem. That guardrail thinking — every play capped by its downside — is the design philosophy across the app.</w:t>
+            </w:r>
+          </w:p>
+        </w:tc>
+      </w:tr>
+    </w:tbl>
+    <w:p>
+      <w:pPr>
+        <w:spacing w:after="120"/>
+      </w:pPr>
+    </w:p>
     <w:p>
       <w:pPr>
         <w:pStyle w:val="Heading2"/>
@@ -2427,6 +4126,68 @@
     </w:p>
     <w:p>
       <w:pPr>
+        <w:spacing w:after="40" w:before="40"/>
+        <w:jc w:val="center"/>
+      </w:pPr>
+      <w:r>
+        <w:drawing>
+          <wp:inline distT="0" distB="0" distL="0" distR="0">
+            <wp:extent cx="5267325" cy="2667000"/>
+            <wp:effectExtent t="0" r="0" b="0" l="0"/>
+            <wp:docPr id="1" name="" descr="" title=""/>
+            <wp:cNvGraphicFramePr>
+              <a:graphicFrameLocks xmlns:a="http://schemas.openxmlformats.org/drawingml/2006/main" noChangeAspect="1"/>
+            </wp:cNvGraphicFramePr>
+            <a:graphic xmlns:a="http://schemas.openxmlformats.org/drawingml/2006/main">
+              <a:graphicData uri="http://schemas.openxmlformats.org/drawingml/2006/picture">
+                <pic:pic xmlns:pic="http://schemas.openxmlformats.org/drawingml/2006/picture">
+                  <pic:nvPicPr>
+                    <pic:cNvPr id="0" name="" descr=""/>
+                    <pic:cNvPicPr>
+                      <a:picLocks noChangeAspect="1" noChangeArrowheads="1"/>
+                    </pic:cNvPicPr>
+                  </pic:nvPicPr>
+                  <pic:blipFill>
+                    <a:blip r:embed="rId18" cstate="none"/>
+                    <a:srcRect/>
+                    <a:stretch>
+                      <a:fillRect/>
+                    </a:stretch>
+                  </pic:blipFill>
+                  <pic:spPr bwMode="auto">
+                    <a:xfrm>
+                      <a:off x="0" y="0"/>
+                      <a:ext cx="5267325" cy="2667000"/>
+                    </a:xfrm>
+                    <a:prstGeom prst="rect">
+                      <a:avLst/>
+                    </a:prstGeom>
+                  </pic:spPr>
+                </pic:pic>
+              </a:graphicData>
+            </a:graphic>
+          </wp:inline>
+        </w:drawing>
+      </w:r>
+    </w:p>
+    <w:p>
+      <w:pPr>
+        <w:spacing w:after="120"/>
+        <w:jc w:val="center"/>
+      </w:pPr>
+      <w:r>
+        <w:rPr>
+          <w:i/>
+          <w:iCs/>
+          <w:color w:val="5A6880"/>
+          <w:sz w:val="16"/>
+          <w:szCs w:val="16"/>
+        </w:rPr>
+        <w:t xml:space="preserve">Captured live from the deployed app (demo data, anchor 2026-07-14).</w:t>
+      </w:r>
+    </w:p>
+    <w:p>
+      <w:pPr>
         <w:spacing w:after="80"/>
         <w:ind w:left="200"/>
       </w:pPr>
@@ -2504,6 +4265,68 @@
           <w:color w:val="2E5BFF"/>
         </w:rPr>
         <w:t xml:space="preserve">Pre-buy option — announced increases (bar)</w:t>
+      </w:r>
+    </w:p>
+    <w:p>
+      <w:pPr>
+        <w:spacing w:after="40" w:before="40"/>
+        <w:jc w:val="center"/>
+      </w:pPr>
+      <w:r>
+        <w:drawing>
+          <wp:inline distT="0" distB="0" distL="0" distR="0">
+            <wp:extent cx="5267325" cy="2667000"/>
+            <wp:effectExtent t="0" r="0" b="0" l="0"/>
+            <wp:docPr id="1" name="" descr="" title=""/>
+            <wp:cNvGraphicFramePr>
+              <a:graphicFrameLocks xmlns:a="http://schemas.openxmlformats.org/drawingml/2006/main" noChangeAspect="1"/>
+            </wp:cNvGraphicFramePr>
+            <a:graphic xmlns:a="http://schemas.openxmlformats.org/drawingml/2006/main">
+              <a:graphicData uri="http://schemas.openxmlformats.org/drawingml/2006/picture">
+                <pic:pic xmlns:pic="http://schemas.openxmlformats.org/drawingml/2006/picture">
+                  <pic:nvPicPr>
+                    <pic:cNvPr id="0" name="" descr=""/>
+                    <pic:cNvPicPr>
+                      <a:picLocks noChangeAspect="1" noChangeArrowheads="1"/>
+                    </pic:cNvPicPr>
+                  </pic:nvPicPr>
+                  <pic:blipFill>
+                    <a:blip r:embed="rId19" cstate="none"/>
+                    <a:srcRect/>
+                    <a:stretch>
+                      <a:fillRect/>
+                    </a:stretch>
+                  </pic:blipFill>
+                  <pic:spPr bwMode="auto">
+                    <a:xfrm>
+                      <a:off x="0" y="0"/>
+                      <a:ext cx="5267325" cy="2667000"/>
+                    </a:xfrm>
+                    <a:prstGeom prst="rect">
+                      <a:avLst/>
+                    </a:prstGeom>
+                  </pic:spPr>
+                </pic:pic>
+              </a:graphicData>
+            </a:graphic>
+          </wp:inline>
+        </w:drawing>
+      </w:r>
+    </w:p>
+    <w:p>
+      <w:pPr>
+        <w:spacing w:after="120"/>
+        <w:jc w:val="center"/>
+      </w:pPr>
+      <w:r>
+        <w:rPr>
+          <w:i/>
+          <w:iCs/>
+          <w:color w:val="5A6880"/>
+          <w:sz w:val="16"/>
+          <w:szCs w:val="16"/>
+        </w:rPr>
+        <w:t xml:space="preserve">Captured live from the deployed app (demo data, anchor 2026-07-14).</w:t>
       </w:r>
     </w:p>
     <w:p>
@@ -2766,8 +4589,125 @@
           <w:sz w:val="21"/>
           <w:szCs w:val="21"/>
         </w:rPr>
-        <w:t xml:space="preserve">Fewer, later, smarter markdowns. Sell-through — not the calendar — triggers the ladder; a margin floor protects the bottom steps; experiments test the timing; stores get the label files automatically.</w:t>
-      </w:r>
+        <w:t xml:space="preserve">Fewer, later, smarter markdowns. Sell-through — not the calendar — triggers the ladder, a margin floor protects the bottom steps, experiments tune the timing, and stores get the label files automatically.</w:t>
+      </w:r>
+    </w:p>
+    <w:tbl>
+      <w:tblPr>
+        <w:tblW w:type="dxa" w:w="9720"/>
+        <w:tblBorders>
+          <w:top w:val="single" w:color="C9D6EC" w:sz="4"/>
+          <w:left w:val="single" w:color="2E5BFF" w:sz="24"/>
+          <w:bottom w:val="single" w:color="C9D6EC" w:sz="4"/>
+          <w:right w:val="single" w:color="C9D6EC" w:sz="4"/>
+          <w:insideH w:val="none"/>
+          <w:insideV w:val="none"/>
+        </w:tblBorders>
+      </w:tblPr>
+      <w:tblGrid>
+        <w:gridCol w:w="9720"/>
+      </w:tblGrid>
+      <w:tr>
+        <w:tc>
+          <w:tcPr>
+            <w:tcW w:type="dxa" w:w="9720"/>
+            <w:shd w:fill="EEF3FF" w:val="clear"/>
+            <w:tcMar>
+              <w:top w:type="dxa" w:w="140"/>
+              <w:left w:type="dxa" w:w="220"/>
+              <w:bottom w:type="dxa" w:w="60"/>
+              <w:right w:type="dxa" w:w="220"/>
+            </w:tcMar>
+          </w:tcPr>
+          <w:p>
+            <w:pPr>
+              <w:spacing w:after="100"/>
+            </w:pPr>
+            <w:r>
+              <w:rPr>
+                <w:b/>
+                <w:bCs/>
+                <w:caps/>
+                <w:color w:val="2E5BFF"/>
+                <w:sz w:val="18"/>
+                <w:szCs w:val="18"/>
+              </w:rPr>
+              <w:t xml:space="preserve">FOR THE SOLUTIONSET TEAM — internal background, not client-facing</w:t>
+            </w:r>
+          </w:p>
+          <w:p>
+            <w:pPr>
+              <w:spacing w:after="80"/>
+            </w:pPr>
+            <w:r>
+              <w:rPr>
+                <w:b/>
+                <w:bCs/>
+                <w:color w:val="1F2A44"/>
+                <w:sz w:val="19"/>
+                <w:szCs w:val="19"/>
+              </w:rPr>
+              <w:t xml:space="preserve">Concepts to know: </w:t>
+            </w:r>
+            <w:r>
+              <w:rPr>
+                <w:sz w:val="19"/>
+                <w:szCs w:val="19"/>
+              </w:rPr>
+              <w:t xml:space="preserve">A markdown is a permanent price cut to clear seasonal goods (vs a promo, which is temporary). Sell-through % = units sold ÷ total season supply — the standard clearance progress metric. A markdown ladder is the pre-planned sequence of cuts (20% → 30% → 50%); the margin floor is the price below which a step loses more margin than the inventory is worth holding. The classic retail failure mode is marking down by calendar habit ('rainwear goes 30% off in June') instead of by season performance.</w:t>
+            </w:r>
+          </w:p>
+          <w:p>
+            <w:pPr>
+              <w:spacing w:after="80"/>
+            </w:pPr>
+            <w:r>
+              <w:rPr>
+                <w:b/>
+                <w:bCs/>
+                <w:color w:val="1F2A44"/>
+                <w:sz w:val="19"/>
+                <w:szCs w:val="19"/>
+              </w:rPr>
+              <w:t xml:space="preserve">Client need: </w:t>
+            </w:r>
+            <w:r>
+              <w:rPr>
+                <w:sz w:val="19"/>
+                <w:szCs w:val="19"/>
+              </w:rPr>
+              <w:t xml:space="preserve">WorkWorld marks down on autopilot and the owners suspect they're giving margin away — either too early on seasons selling fine, or too late (missing the clearance window entirely). The season chart answers the suspicion with data, and the experiment cards show timing being tested rather than argued about.</w:t>
+            </w:r>
+          </w:p>
+          <w:p>
+            <w:pPr>
+              <w:spacing w:after="80"/>
+            </w:pPr>
+            <w:r>
+              <w:rPr>
+                <w:b/>
+                <w:bCs/>
+                <w:color w:val="1F2A44"/>
+                <w:sz w:val="19"/>
+                <w:szCs w:val="19"/>
+              </w:rPr>
+              <w:t xml:space="preserve">What to internalize: </w:t>
+            </w:r>
+            <w:r>
+              <w:rPr>
+                <w:sz w:val="19"/>
+                <w:szCs w:val="19"/>
+              </w:rPr>
+              <w:t xml:space="preserve">The line that lands: 'the best markdown is the one you never take.' Everything in the module pushes toward triggering from sell-through and stopping above the floor. The delayed-ladder test (MD-004) shows the client this isn't dogma — it's testable.</w:t>
+            </w:r>
+          </w:p>
+        </w:tc>
+      </w:tr>
+    </w:tbl>
+    <w:p>
+      <w:pPr>
+        <w:spacing w:after="120"/>
+      </w:pPr>
     </w:p>
     <w:p>
       <w:pPr>
@@ -2864,6 +4804,68 @@
     </w:p>
     <w:p>
       <w:pPr>
+        <w:spacing w:after="40" w:before="40"/>
+        <w:jc w:val="center"/>
+      </w:pPr>
+      <w:r>
+        <w:drawing>
+          <wp:inline distT="0" distB="0" distL="0" distR="0">
+            <wp:extent cx="6096000" cy="1790700"/>
+            <wp:effectExtent t="0" r="0" b="0" l="0"/>
+            <wp:docPr id="1" name="" descr="" title=""/>
+            <wp:cNvGraphicFramePr>
+              <a:graphicFrameLocks xmlns:a="http://schemas.openxmlformats.org/drawingml/2006/main" noChangeAspect="1"/>
+            </wp:cNvGraphicFramePr>
+            <a:graphic xmlns:a="http://schemas.openxmlformats.org/drawingml/2006/main">
+              <a:graphicData uri="http://schemas.openxmlformats.org/drawingml/2006/picture">
+                <pic:pic xmlns:pic="http://schemas.openxmlformats.org/drawingml/2006/picture">
+                  <pic:nvPicPr>
+                    <pic:cNvPr id="0" name="" descr=""/>
+                    <pic:cNvPicPr>
+                      <a:picLocks noChangeAspect="1" noChangeArrowheads="1"/>
+                    </pic:cNvPicPr>
+                  </pic:nvPicPr>
+                  <pic:blipFill>
+                    <a:blip r:embed="rId20" cstate="none"/>
+                    <a:srcRect/>
+                    <a:stretch>
+                      <a:fillRect/>
+                    </a:stretch>
+                  </pic:blipFill>
+                  <pic:spPr bwMode="auto">
+                    <a:xfrm>
+                      <a:off x="0" y="0"/>
+                      <a:ext cx="6096000" cy="1790700"/>
+                    </a:xfrm>
+                    <a:prstGeom prst="rect">
+                      <a:avLst/>
+                    </a:prstGeom>
+                  </pic:spPr>
+                </pic:pic>
+              </a:graphicData>
+            </a:graphic>
+          </wp:inline>
+        </w:drawing>
+      </w:r>
+    </w:p>
+    <w:p>
+      <w:pPr>
+        <w:spacing w:after="120"/>
+        <w:jc w:val="center"/>
+      </w:pPr>
+      <w:r>
+        <w:rPr>
+          <w:i/>
+          <w:iCs/>
+          <w:color w:val="5A6880"/>
+          <w:sz w:val="16"/>
+          <w:szCs w:val="16"/>
+        </w:rPr>
+        <w:t xml:space="preserve">Captured live from the deployed app (demo data, anchor 2026-07-14).</w:t>
+      </w:r>
+    </w:p>
+    <w:p>
+      <w:pPr>
         <w:spacing w:after="80"/>
         <w:ind w:left="200"/>
       </w:pPr>
@@ -2941,6 +4943,68 @@
           <w:color w:val="2E5BFF"/>
         </w:rPr>
         <w:t xml:space="preserve">Ladder economics vs the floor (bar + line)</w:t>
+      </w:r>
+    </w:p>
+    <w:p>
+      <w:pPr>
+        <w:spacing w:after="40" w:before="40"/>
+        <w:jc w:val="center"/>
+      </w:pPr>
+      <w:r>
+        <w:drawing>
+          <wp:inline distT="0" distB="0" distL="0" distR="0">
+            <wp:extent cx="5267325" cy="2667000"/>
+            <wp:effectExtent t="0" r="0" b="0" l="0"/>
+            <wp:docPr id="1" name="" descr="" title=""/>
+            <wp:cNvGraphicFramePr>
+              <a:graphicFrameLocks xmlns:a="http://schemas.openxmlformats.org/drawingml/2006/main" noChangeAspect="1"/>
+            </wp:cNvGraphicFramePr>
+            <a:graphic xmlns:a="http://schemas.openxmlformats.org/drawingml/2006/main">
+              <a:graphicData uri="http://schemas.openxmlformats.org/drawingml/2006/picture">
+                <pic:pic xmlns:pic="http://schemas.openxmlformats.org/drawingml/2006/picture">
+                  <pic:nvPicPr>
+                    <pic:cNvPr id="0" name="" descr=""/>
+                    <pic:cNvPicPr>
+                      <a:picLocks noChangeAspect="1" noChangeArrowheads="1"/>
+                    </pic:cNvPicPr>
+                  </pic:nvPicPr>
+                  <pic:blipFill>
+                    <a:blip r:embed="rId21" cstate="none"/>
+                    <a:srcRect/>
+                    <a:stretch>
+                      <a:fillRect/>
+                    </a:stretch>
+                  </pic:blipFill>
+                  <pic:spPr bwMode="auto">
+                    <a:xfrm>
+                      <a:off x="0" y="0"/>
+                      <a:ext cx="5267325" cy="2667000"/>
+                    </a:xfrm>
+                    <a:prstGeom prst="rect">
+                      <a:avLst/>
+                    </a:prstGeom>
+                  </pic:spPr>
+                </pic:pic>
+              </a:graphicData>
+            </a:graphic>
+          </wp:inline>
+        </w:drawing>
+      </w:r>
+    </w:p>
+    <w:p>
+      <w:pPr>
+        <w:spacing w:after="120"/>
+        <w:jc w:val="center"/>
+      </w:pPr>
+      <w:r>
+        <w:rPr>
+          <w:i/>
+          <w:iCs/>
+          <w:color w:val="5A6880"/>
+          <w:sz w:val="16"/>
+          <w:szCs w:val="16"/>
+        </w:rPr>
+        <w:t xml:space="preserve">Captured live from the deployed app (demo data, anchor 2026-07-14).</w:t>
       </w:r>
     </w:p>
     <w:p>
@@ -3287,6 +5351,123 @@
         <w:t xml:space="preserve">Every upstream decision — a price change, a markdown, a transfer — lands here as an LLM-drafted, human-approved message and a store checklist with overdue escalation. Same alert pattern the client already knows from the labor module.</w:t>
       </w:r>
     </w:p>
+    <w:tbl>
+      <w:tblPr>
+        <w:tblW w:type="dxa" w:w="9720"/>
+        <w:tblBorders>
+          <w:top w:val="single" w:color="C9D6EC" w:sz="4"/>
+          <w:left w:val="single" w:color="2E5BFF" w:sz="24"/>
+          <w:bottom w:val="single" w:color="C9D6EC" w:sz="4"/>
+          <w:right w:val="single" w:color="C9D6EC" w:sz="4"/>
+          <w:insideH w:val="none"/>
+          <w:insideV w:val="none"/>
+        </w:tblBorders>
+      </w:tblPr>
+      <w:tblGrid>
+        <w:gridCol w:w="9720"/>
+      </w:tblGrid>
+      <w:tr>
+        <w:tc>
+          <w:tcPr>
+            <w:tcW w:type="dxa" w:w="9720"/>
+            <w:shd w:fill="EEF3FF" w:val="clear"/>
+            <w:tcMar>
+              <w:top w:type="dxa" w:w="140"/>
+              <w:left w:type="dxa" w:w="220"/>
+              <w:bottom w:type="dxa" w:w="60"/>
+              <w:right w:type="dxa" w:w="220"/>
+            </w:tcMar>
+          </w:tcPr>
+          <w:p>
+            <w:pPr>
+              <w:spacing w:after="100"/>
+            </w:pPr>
+            <w:r>
+              <w:rPr>
+                <w:b/>
+                <w:bCs/>
+                <w:caps/>
+                <w:color w:val="2E5BFF"/>
+                <w:sz w:val="18"/>
+                <w:szCs w:val="18"/>
+              </w:rPr>
+              <w:t xml:space="preserve">FOR THE SOLUTIONSET TEAM — internal background, not client-facing</w:t>
+            </w:r>
+          </w:p>
+          <w:p>
+            <w:pPr>
+              <w:spacing w:after="80"/>
+            </w:pPr>
+            <w:r>
+              <w:rPr>
+                <w:b/>
+                <w:bCs/>
+                <w:color w:val="1F2A44"/>
+                <w:sz w:val="19"/>
+                <w:szCs w:val="19"/>
+              </w:rPr>
+              <w:t xml:space="preserve">Concepts to know: </w:t>
+            </w:r>
+            <w:r>
+              <w:rPr>
+                <w:sz w:val="19"/>
+                <w:szCs w:val="19"/>
+              </w:rPr>
+              <w:t xml:space="preserve">Retail 'task management' is the category (Zipline is the best-known name): HQ decisions become store-level checklists with due dates, completion tracking, and escalation. The insight is that merchandising decisions are only real when a store associate physically does something — retags a shelf, builds an endcap, prints labels. 'LLM-drafted, human-approved' means the AI writes the store memo from the event's facts; a merchant approves before anything sends.</w:t>
+            </w:r>
+          </w:p>
+          <w:p>
+            <w:pPr>
+              <w:spacing w:after="80"/>
+            </w:pPr>
+            <w:r>
+              <w:rPr>
+                <w:b/>
+                <w:bCs/>
+                <w:color w:val="1F2A44"/>
+                <w:sz w:val="19"/>
+                <w:szCs w:val="19"/>
+              </w:rPr>
+              <w:t xml:space="preserve">Client need: </w:t>
+            </w:r>
+            <w:r>
+              <w:rPr>
+                <w:sz w:val="19"/>
+                <w:szCs w:val="19"/>
+              </w:rPr>
+              <w:t xml:space="preserve">Decisions die between HQ and 38 stores. WorkWorld has no systematic way to know whether store 14 actually retagged after the last price change. Overdue escalation to the district manager mirrors the alerting pattern from the labor module we already built them — familiarity is deliberate.</w:t>
+            </w:r>
+          </w:p>
+          <w:p>
+            <w:pPr>
+              <w:spacing w:after="80"/>
+            </w:pPr>
+            <w:r>
+              <w:rPr>
+                <w:b/>
+                <w:bCs/>
+                <w:color w:val="1F2A44"/>
+                <w:sz w:val="19"/>
+                <w:szCs w:val="19"/>
+              </w:rPr>
+              <w:t xml:space="preserve">What to internalize: </w:t>
+            </w:r>
+            <w:r>
+              <w:rPr>
+                <w:sz w:val="19"/>
+                <w:szCs w:val="19"/>
+              </w:rPr>
+              <w:t xml:space="preserve">This module is thin on analytics by design — it's the execution receipt for Modules 7 and 8. When demoing, trace one price event from Module 7 to its tasks here; that closed loop is the story.</w:t>
+            </w:r>
+          </w:p>
+        </w:tc>
+      </w:tr>
+    </w:tbl>
+    <w:p>
+      <w:pPr>
+        <w:spacing w:after="120"/>
+      </w:pPr>
+    </w:p>
     <w:p>
       <w:pPr>
         <w:pStyle w:val="Heading2"/>
@@ -3480,6 +5661,123 @@
         </w:rPr>
         <w:t xml:space="preserve">The housekeeping made visible: which tables feed automatically, which are manually maintained, how fresh each one is, and who owns it. This is the honest slide — sustainable analytics means knowing where the manual effort lives.</w:t>
       </w:r>
+    </w:p>
+    <w:tbl>
+      <w:tblPr>
+        <w:tblW w:type="dxa" w:w="9720"/>
+        <w:tblBorders>
+          <w:top w:val="single" w:color="C9D6EC" w:sz="4"/>
+          <w:left w:val="single" w:color="2E5BFF" w:sz="24"/>
+          <w:bottom w:val="single" w:color="C9D6EC" w:sz="4"/>
+          <w:right w:val="single" w:color="C9D6EC" w:sz="4"/>
+          <w:insideH w:val="none"/>
+          <w:insideV w:val="none"/>
+        </w:tblBorders>
+      </w:tblPr>
+      <w:tblGrid>
+        <w:gridCol w:w="9720"/>
+      </w:tblGrid>
+      <w:tr>
+        <w:tc>
+          <w:tcPr>
+            <w:tcW w:type="dxa" w:w="9720"/>
+            <w:shd w:fill="EEF3FF" w:val="clear"/>
+            <w:tcMar>
+              <w:top w:type="dxa" w:w="140"/>
+              <w:left w:type="dxa" w:w="220"/>
+              <w:bottom w:type="dxa" w:w="60"/>
+              <w:right w:type="dxa" w:w="220"/>
+            </w:tcMar>
+          </w:tcPr>
+          <w:p>
+            <w:pPr>
+              <w:spacing w:after="100"/>
+            </w:pPr>
+            <w:r>
+              <w:rPr>
+                <w:b/>
+                <w:bCs/>
+                <w:caps/>
+                <w:color w:val="2E5BFF"/>
+                <w:sz w:val="18"/>
+                <w:szCs w:val="18"/>
+              </w:rPr>
+              <w:t xml:space="preserve">FOR THE SOLUTIONSET TEAM — internal background, not client-facing</w:t>
+            </w:r>
+          </w:p>
+          <w:p>
+            <w:pPr>
+              <w:spacing w:after="80"/>
+            </w:pPr>
+            <w:r>
+              <w:rPr>
+                <w:b/>
+                <w:bCs/>
+                <w:color w:val="1F2A44"/>
+                <w:sz w:val="19"/>
+                <w:szCs w:val="19"/>
+              </w:rPr>
+              <w:t xml:space="preserve">Concepts to know: </w:t>
+            </w:r>
+            <w:r>
+              <w:rPr>
+                <w:sz w:val="19"/>
+                <w:szCs w:val="19"/>
+              </w:rPr>
+              <w:t xml:space="preserve">Every analytics platform runs on a mix of automated feeds (POS sales landing nightly) and manually maintained reference data (size curves, item cross-references, vendor terms someone keys in). The manual tables are where data quality quietly dies — someone leaves, the spreadsheet stops being updated, and six months later the 'automated' insights are wrong. Data stewardship = making ownership and cadence explicit.</w:t>
+            </w:r>
+          </w:p>
+          <w:p>
+            <w:pPr>
+              <w:spacing w:after="80"/>
+            </w:pPr>
+            <w:r>
+              <w:rPr>
+                <w:b/>
+                <w:bCs/>
+                <w:color w:val="1F2A44"/>
+                <w:sz w:val="19"/>
+                <w:szCs w:val="19"/>
+              </w:rPr>
+              <w:t xml:space="preserve">Client need: </w:t>
+            </w:r>
+            <w:r>
+              <w:rPr>
+                <w:sz w:val="19"/>
+                <w:szCs w:val="19"/>
+              </w:rPr>
+              <w:t xml:space="preserve">WorkWorld has been burned by reports that drifted from reality. Showing them the manual/feed split up front — with owners and last-load timestamps — is a trust move, and it doubles as our own implementation punch list (every orange row is future automation work, i.e., roadmap and revenue).</w:t>
+            </w:r>
+          </w:p>
+          <w:p>
+            <w:pPr>
+              <w:spacing w:after="80"/>
+            </w:pPr>
+            <w:r>
+              <w:rPr>
+                <w:b/>
+                <w:bCs/>
+                <w:color w:val="1F2A44"/>
+                <w:sz w:val="19"/>
+                <w:szCs w:val="19"/>
+              </w:rPr>
+              <w:t xml:space="preserve">What to internalize: </w:t>
+            </w:r>
+            <w:r>
+              <w:rPr>
+                <w:sz w:val="19"/>
+                <w:szCs w:val="19"/>
+              </w:rPr>
+              <w:t xml:space="preserve">Don't skip this module in demos to owners — ending on honesty lands better than ending on fireworks. Point at item_crossref specifically: its completeness is what the ATS match rate in Module 4 depends on, which proves the modules are one connected system.</w:t>
+            </w:r>
+          </w:p>
+        </w:tc>
+      </w:tr>
+    </w:tbl>
+    <w:p>
+      <w:pPr>
+        <w:spacing w:after="120"/>
+      </w:pPr>
     </w:p>
     <w:p>
       <w:pPr>

</xml_diff>